<commit_message>
Proje 5: Veri dönüştürme ve hedef tabloya yükleme süreçleri tamamlandı
</commit_message>
<xml_diff>
--- a/BLM4522_Proje5/Proje5_Rapor.docx
+++ b/BLM4522_Proje5/Proje5_Rapor.docx
@@ -177,7 +177,7 @@
           <w:sz w:val="28"/>
           <w:szCs w:val="28"/>
         </w:rPr>
-        <w:t>5</w:t>
+        <w:t xml:space="preserve">5: </w:t>
       </w:r>
       <w:r>
         <w:rPr>
@@ -187,7 +187,7 @@
           <w:sz w:val="28"/>
           <w:szCs w:val="28"/>
         </w:rPr>
-        <w:t xml:space="preserve">: </w:t>
+        <w:t xml:space="preserve"> </w:t>
       </w:r>
       <w:r>
         <w:rPr>
@@ -197,8 +197,9 @@
           <w:sz w:val="28"/>
           <w:szCs w:val="28"/>
         </w:rPr>
-        <w:t xml:space="preserve"> </w:t>
-      </w:r>
+        <w:t>Veri</w:t>
+      </w:r>
+      <w:proofErr w:type="gramEnd"/>
       <w:r>
         <w:rPr>
           <w:rFonts w:cs="Arial"/>
@@ -207,17 +208,6 @@
           <w:sz w:val="28"/>
           <w:szCs w:val="28"/>
         </w:rPr>
-        <w:t>Veri</w:t>
-      </w:r>
-      <w:proofErr w:type="gramEnd"/>
-      <w:r>
-        <w:rPr>
-          <w:rFonts w:cs="Arial"/>
-          <w:b/>
-          <w:bCs/>
-          <w:sz w:val="28"/>
-          <w:szCs w:val="28"/>
-        </w:rPr>
         <w:t xml:space="preserve"> Temizleme ve ETL Süreçleri Tasarım</w:t>
       </w:r>
     </w:p>
@@ -275,23 +265,7 @@
           <w:b/>
           <w:color w:val="000000" w:themeColor="text1"/>
         </w:rPr>
-        <w:t>0</w:t>
-      </w:r>
-      <w:r>
-        <w:rPr>
-          <w:rFonts w:cs="Arial"/>
-          <w:b/>
-          <w:color w:val="000000" w:themeColor="text1"/>
-        </w:rPr>
-        <w:t>3</w:t>
-      </w:r>
-      <w:r>
-        <w:rPr>
-          <w:rFonts w:cs="Arial"/>
-          <w:b/>
-          <w:color w:val="000000" w:themeColor="text1"/>
-        </w:rPr>
-        <w:t xml:space="preserve">.06.2026 </w:t>
+        <w:t xml:space="preserve">03.06.2026 </w:t>
       </w:r>
     </w:p>
     <w:p>
@@ -442,7 +416,7 @@
           <w:r>
             <w:fldChar w:fldCharType="separate"/>
           </w:r>
-          <w:hyperlink w:anchor="_Toc231395601" w:history="1">
+          <w:hyperlink w:anchor="_Toc231395883" w:history="1">
             <w:r>
               <w:rPr>
                 <w:rStyle w:val="Kpr"/>
@@ -469,7 +443,7 @@
                 <w:noProof/>
                 <w:webHidden/>
               </w:rPr>
-              <w:instrText xml:space="preserve"> PAGEREF _Toc231395601 \h </w:instrText>
+              <w:instrText xml:space="preserve"> PAGEREF _Toc231395883 \h </w:instrText>
             </w:r>
             <w:r>
               <w:rPr>
@@ -513,7 +487,7 @@
               <w14:ligatures w14:val="standardContextual"/>
             </w:rPr>
           </w:pPr>
-          <w:hyperlink w:anchor="_Toc231395602" w:history="1">
+          <w:hyperlink w:anchor="_Toc231395884" w:history="1">
             <w:r>
               <w:rPr>
                 <w:rStyle w:val="Kpr"/>
@@ -540,7 +514,7 @@
                 <w:noProof/>
                 <w:webHidden/>
               </w:rPr>
-              <w:instrText xml:space="preserve"> PAGEREF _Toc231395602 \h </w:instrText>
+              <w:instrText xml:space="preserve"> PAGEREF _Toc231395884 \h </w:instrText>
             </w:r>
             <w:r>
               <w:rPr>
@@ -572,6 +546,77 @@
           </w:hyperlink>
         </w:p>
         <w:p>
+          <w:pPr>
+            <w:pStyle w:val="T2"/>
+            <w:rPr>
+              <w:rFonts w:asciiTheme="minorHAnsi" w:eastAsiaTheme="minorEastAsia" w:hAnsiTheme="minorHAnsi" w:cstheme="minorBidi"/>
+              <w:b w:val="0"/>
+              <w:noProof/>
+              <w:kern w:val="2"/>
+              <w:u w:val="none"/>
+              <w:lang w:eastAsia="tr-TR"/>
+              <w14:ligatures w14:val="standardContextual"/>
+            </w:rPr>
+          </w:pPr>
+          <w:hyperlink w:anchor="_Toc231395885" w:history="1">
+            <w:r>
+              <w:rPr>
+                <w:rStyle w:val="Kpr"/>
+                <w:noProof/>
+              </w:rPr>
+              <w:t>Adım 2: Veri Dönüştürme ve Hedef Sisteme Yükleme</w:t>
+            </w:r>
+            <w:r>
+              <w:rPr>
+                <w:noProof/>
+                <w:webHidden/>
+              </w:rPr>
+              <w:tab/>
+            </w:r>
+            <w:r>
+              <w:rPr>
+                <w:noProof/>
+                <w:webHidden/>
+              </w:rPr>
+              <w:fldChar w:fldCharType="begin"/>
+            </w:r>
+            <w:r>
+              <w:rPr>
+                <w:noProof/>
+                <w:webHidden/>
+              </w:rPr>
+              <w:instrText xml:space="preserve"> PAGEREF _Toc231395885 \h </w:instrText>
+            </w:r>
+            <w:r>
+              <w:rPr>
+                <w:noProof/>
+                <w:webHidden/>
+              </w:rPr>
+            </w:r>
+            <w:r>
+              <w:rPr>
+                <w:noProof/>
+                <w:webHidden/>
+              </w:rPr>
+              <w:fldChar w:fldCharType="separate"/>
+            </w:r>
+            <w:r>
+              <w:rPr>
+                <w:noProof/>
+                <w:webHidden/>
+              </w:rPr>
+              <w:t>4</w:t>
+            </w:r>
+            <w:r>
+              <w:rPr>
+                <w:noProof/>
+                <w:webHidden/>
+              </w:rPr>
+              <w:fldChar w:fldCharType="end"/>
+            </w:r>
+          </w:hyperlink>
+        </w:p>
+        <w:p>
           <w:r>
             <w:rPr>
               <w:b/>
@@ -610,7 +655,7 @@
         <w:pStyle w:val="Balk1"/>
         <w:jc w:val="center"/>
       </w:pPr>
-      <w:bookmarkStart w:id="0" w:name="_Toc231395601"/>
+      <w:bookmarkStart w:id="0" w:name="_Toc231395883"/>
       <w:r>
         <w:lastRenderedPageBreak/>
         <w:t xml:space="preserve">Proje </w:t>
@@ -640,7 +685,7 @@
       <w:pPr>
         <w:pStyle w:val="Balk2"/>
       </w:pPr>
-      <w:bookmarkStart w:id="1" w:name="_Toc231395602"/>
+      <w:bookmarkStart w:id="1" w:name="_Toc231395884"/>
       <w:r>
         <w:t xml:space="preserve">Adım 1: </w:t>
       </w:r>
@@ -651,10 +696,7 @@
     </w:p>
     <w:p>
       <w:r>
-        <w:t>Veri temizleme ve ETL süreçleri tasarımı projesinde</w:t>
-      </w:r>
-      <w:r>
-        <w:t xml:space="preserve"> veri kaynağı olarak Microsoft'un kurumsal ölçekli AdventureWorks2019 ilişkisel örnek </w:t>
+        <w:t xml:space="preserve">Veri temizleme ve ETL süreçleri tasarımı projesinde veri kaynağı olarak Microsoft'un kurumsal ölçekli AdventureWorks2019 ilişkisel örnek </w:t>
       </w:r>
       <w:proofErr w:type="spellStart"/>
       <w:r>
@@ -729,10 +771,13 @@
     </w:p>
     <w:p>
       <w:r>
+        <w:rPr>
+          <w:noProof/>
+        </w:rPr>
         <w:drawing>
-          <wp:inline distT="0" distB="0" distL="0" distR="0" wp14:anchorId="10209C9E" wp14:editId="7D85C964">
-            <wp:extent cx="4930567" cy="739204"/>
-            <wp:effectExtent l="0" t="0" r="3810" b="3810"/>
+          <wp:inline distT="0" distB="0" distL="0" distR="0" wp14:anchorId="10209C9E" wp14:editId="58B88EC0">
+            <wp:extent cx="6454926" cy="967740"/>
+            <wp:effectExtent l="0" t="0" r="3175" b="3810"/>
             <wp:docPr id="592297374" name="Resim 1" descr="metin, ekran görüntüsü, çizgi, yazı tipi içeren bir resim&#10;&#10;Yapay zeka tarafından oluşturulmuş içerik yanlış olabilir."/>
             <wp:cNvGraphicFramePr>
               <a:graphicFrameLocks xmlns:a="http://schemas.openxmlformats.org/drawingml/2006/main" noChangeAspect="1"/>
@@ -753,7 +798,7 @@
                   <pic:spPr>
                     <a:xfrm>
                       <a:off x="0" y="0"/>
-                      <a:ext cx="4930567" cy="739204"/>
+                      <a:ext cx="6463888" cy="969084"/>
                     </a:xfrm>
                     <a:prstGeom prst="rect">
                       <a:avLst/>
@@ -766,6 +811,155 @@
         </w:drawing>
       </w:r>
     </w:p>
+    <w:p/>
+    <w:p/>
+    <w:p/>
+    <w:p/>
+    <w:p/>
+    <w:p/>
+    <w:p/>
+    <w:p/>
+    <w:p/>
+    <w:p/>
+    <w:p>
+      <w:r>
+        <w:t>03.06.2026</w:t>
+      </w:r>
+    </w:p>
+    <w:p>
+      <w:pPr>
+        <w:pStyle w:val="Balk2"/>
+      </w:pPr>
+      <w:bookmarkStart w:id="2" w:name="_Toc231395885"/>
+      <w:r>
+        <w:t>Adım 2:</w:t>
+      </w:r>
+      <w:r>
+        <w:t xml:space="preserve"> </w:t>
+      </w:r>
+      <w:r>
+        <w:t>Veri Dönüştürme ve Hedef Sisteme Yükleme</w:t>
+      </w:r>
+      <w:bookmarkEnd w:id="2"/>
+    </w:p>
+    <w:p>
+      <w:r>
+        <w:t xml:space="preserve">ETL sürecinin ikinci ve üçüncü fazları olan verinin dönüştürülmesi ve temiz olarak hedef ambar yapısına yüklenmesi işlemleri bu adımda gerçekleştirilmiştir. Yazılan dinamik T-SQL </w:t>
+      </w:r>
+      <w:proofErr w:type="spellStart"/>
+      <w:r>
+        <w:t>scripti</w:t>
+      </w:r>
+      <w:proofErr w:type="spellEnd"/>
+      <w:r>
+        <w:t xml:space="preserve"> sayesinde ham veriler kurumsal standartlara uygun hale getirilmektedir.</w:t>
+      </w:r>
+    </w:p>
+    <w:p>
+      <w:pPr>
+        <w:numPr>
+          <w:ilvl w:val="0"/>
+          <w:numId w:val="2"/>
+        </w:numPr>
+      </w:pPr>
+      <w:proofErr w:type="spellStart"/>
+      <w:r>
+        <w:t>Person.Person</w:t>
+      </w:r>
+      <w:proofErr w:type="spellEnd"/>
+      <w:r>
+        <w:t xml:space="preserve"> tablosundaki parça ad bütünlüğü, dize birleştirme fonksiyonları kullanılarak </w:t>
+      </w:r>
+      <w:proofErr w:type="spellStart"/>
+      <w:r>
+        <w:t>FullName</w:t>
+      </w:r>
+      <w:proofErr w:type="spellEnd"/>
+      <w:r>
+        <w:t xml:space="preserve"> adı altında tekil ve standart bir yapıya dönüştürülmüştür.</w:t>
+      </w:r>
+    </w:p>
+    <w:p>
+      <w:pPr>
+        <w:numPr>
+          <w:ilvl w:val="0"/>
+          <w:numId w:val="2"/>
+        </w:numPr>
+      </w:pPr>
+      <w:proofErr w:type="spellStart"/>
+      <w:r>
+        <w:t>Person.PersonPhone</w:t>
+      </w:r>
+      <w:proofErr w:type="spellEnd"/>
+      <w:r>
+        <w:t xml:space="preserve"> tablosundan çekilen ham telefon verilerindeki tire (-), parantez () ve boşluk gibi karakterler REPLACE algoritmalarıyla ayıklanarak salt sayısal formata indirilmiştir.</w:t>
+      </w:r>
+    </w:p>
+    <w:p>
+      <w:pPr>
+        <w:numPr>
+          <w:ilvl w:val="0"/>
+          <w:numId w:val="2"/>
+        </w:numPr>
+      </w:pPr>
+      <w:r>
+        <w:t xml:space="preserve">Temizlenen ve standartlaştırılan tüm veri kümeleri, herhangi bir veri kaybı olmaksızın </w:t>
+      </w:r>
+      <w:proofErr w:type="spellStart"/>
+      <w:r>
+        <w:t>ETL_Clean_People</w:t>
+      </w:r>
+      <w:proofErr w:type="spellEnd"/>
+      <w:r>
+        <w:t xml:space="preserve"> hedef tablosuna başarılı bir şekilde aktarılmış ve veri ambarı yükleme süreci tamamlanmış olmaktadır.</w:t>
+      </w:r>
+    </w:p>
+    <w:p>
+      <w:r>
+        <w:drawing>
+          <wp:inline distT="0" distB="0" distL="0" distR="0" wp14:anchorId="367A734D" wp14:editId="781608EF">
+            <wp:extent cx="5257800" cy="2819670"/>
+            <wp:effectExtent l="0" t="0" r="0" b="0"/>
+            <wp:docPr id="1811675422" name="Resim 1" descr="metin, ekran görüntüsü, yazı tipi, sayı, numara içeren bir resim&#10;&#10;Yapay zeka tarafından oluşturulmuş içerik yanlış olabilir."/>
+            <wp:cNvGraphicFramePr>
+              <a:graphicFrameLocks xmlns:a="http://schemas.openxmlformats.org/drawingml/2006/main" noChangeAspect="1"/>
+            </wp:cNvGraphicFramePr>
+            <a:graphic xmlns:a="http://schemas.openxmlformats.org/drawingml/2006/main">
+              <a:graphicData uri="http://schemas.openxmlformats.org/drawingml/2006/picture">
+                <pic:pic xmlns:pic="http://schemas.openxmlformats.org/drawingml/2006/picture">
+                  <pic:nvPicPr>
+                    <pic:cNvPr id="1811675422" name="Resim 1" descr="metin, ekran görüntüsü, yazı tipi, sayı, numara içeren bir resim&#10;&#10;Yapay zeka tarafından oluşturulmuş içerik yanlış olabilir."/>
+                    <pic:cNvPicPr/>
+                  </pic:nvPicPr>
+                  <pic:blipFill>
+                    <a:blip r:embed="rId7"/>
+                    <a:stretch>
+                      <a:fillRect/>
+                    </a:stretch>
+                  </pic:blipFill>
+                  <pic:spPr>
+                    <a:xfrm>
+                      <a:off x="0" y="0"/>
+                      <a:ext cx="5268396" cy="2825353"/>
+                    </a:xfrm>
+                    <a:prstGeom prst="rect">
+                      <a:avLst/>
+                    </a:prstGeom>
+                  </pic:spPr>
+                </pic:pic>
+              </a:graphicData>
+            </a:graphic>
+          </wp:inline>
+        </w:drawing>
+      </w:r>
+    </w:p>
+    <w:p/>
+    <w:p/>
+    <w:p/>
+    <w:p/>
+    <w:p/>
+    <w:p/>
+    <w:p/>
     <w:sectPr>
       <w:pgSz w:w="11906" w:h="16838"/>
       <w:pgMar w:top="1417" w:right="1417" w:bottom="1417" w:left="1417" w:header="708" w:footer="708" w:gutter="0"/>
@@ -927,8 +1121,160 @@
       </w:rPr>
     </w:lvl>
   </w:abstractNum>
+  <w:abstractNum w:abstractNumId="1" w15:restartNumberingAfterBreak="0">
+    <w:nsid w:val="5174145C"/>
+    <w:multiLevelType w:val="multilevel"/>
+    <w:tmpl w:val="784EB6AA"/>
+    <w:lvl w:ilvl="0">
+      <w:start w:val="1"/>
+      <w:numFmt w:val="bullet"/>
+      <w:lvlText w:val=""/>
+      <w:lvlJc w:val="left"/>
+      <w:pPr>
+        <w:tabs>
+          <w:tab w:val="num" w:pos="720"/>
+        </w:tabs>
+        <w:ind w:left="720" w:hanging="360"/>
+      </w:pPr>
+      <w:rPr>
+        <w:rFonts w:ascii="Symbol" w:hAnsi="Symbol" w:hint="default"/>
+        <w:sz w:val="20"/>
+      </w:rPr>
+    </w:lvl>
+    <w:lvl w:ilvl="1" w:tentative="1">
+      <w:start w:val="1"/>
+      <w:numFmt w:val="bullet"/>
+      <w:lvlText w:val="o"/>
+      <w:lvlJc w:val="left"/>
+      <w:pPr>
+        <w:tabs>
+          <w:tab w:val="num" w:pos="1440"/>
+        </w:tabs>
+        <w:ind w:left="1440" w:hanging="360"/>
+      </w:pPr>
+      <w:rPr>
+        <w:rFonts w:ascii="Courier New" w:hAnsi="Courier New" w:hint="default"/>
+        <w:sz w:val="20"/>
+      </w:rPr>
+    </w:lvl>
+    <w:lvl w:ilvl="2" w:tentative="1">
+      <w:start w:val="1"/>
+      <w:numFmt w:val="bullet"/>
+      <w:lvlText w:val=""/>
+      <w:lvlJc w:val="left"/>
+      <w:pPr>
+        <w:tabs>
+          <w:tab w:val="num" w:pos="2160"/>
+        </w:tabs>
+        <w:ind w:left="2160" w:hanging="360"/>
+      </w:pPr>
+      <w:rPr>
+        <w:rFonts w:ascii="Wingdings" w:hAnsi="Wingdings" w:hint="default"/>
+        <w:sz w:val="20"/>
+      </w:rPr>
+    </w:lvl>
+    <w:lvl w:ilvl="3" w:tentative="1">
+      <w:start w:val="1"/>
+      <w:numFmt w:val="bullet"/>
+      <w:lvlText w:val=""/>
+      <w:lvlJc w:val="left"/>
+      <w:pPr>
+        <w:tabs>
+          <w:tab w:val="num" w:pos="2880"/>
+        </w:tabs>
+        <w:ind w:left="2880" w:hanging="360"/>
+      </w:pPr>
+      <w:rPr>
+        <w:rFonts w:ascii="Wingdings" w:hAnsi="Wingdings" w:hint="default"/>
+        <w:sz w:val="20"/>
+      </w:rPr>
+    </w:lvl>
+    <w:lvl w:ilvl="4" w:tentative="1">
+      <w:start w:val="1"/>
+      <w:numFmt w:val="bullet"/>
+      <w:lvlText w:val=""/>
+      <w:lvlJc w:val="left"/>
+      <w:pPr>
+        <w:tabs>
+          <w:tab w:val="num" w:pos="3600"/>
+        </w:tabs>
+        <w:ind w:left="3600" w:hanging="360"/>
+      </w:pPr>
+      <w:rPr>
+        <w:rFonts w:ascii="Wingdings" w:hAnsi="Wingdings" w:hint="default"/>
+        <w:sz w:val="20"/>
+      </w:rPr>
+    </w:lvl>
+    <w:lvl w:ilvl="5" w:tentative="1">
+      <w:start w:val="1"/>
+      <w:numFmt w:val="bullet"/>
+      <w:lvlText w:val=""/>
+      <w:lvlJc w:val="left"/>
+      <w:pPr>
+        <w:tabs>
+          <w:tab w:val="num" w:pos="4320"/>
+        </w:tabs>
+        <w:ind w:left="4320" w:hanging="360"/>
+      </w:pPr>
+      <w:rPr>
+        <w:rFonts w:ascii="Wingdings" w:hAnsi="Wingdings" w:hint="default"/>
+        <w:sz w:val="20"/>
+      </w:rPr>
+    </w:lvl>
+    <w:lvl w:ilvl="6" w:tentative="1">
+      <w:start w:val="1"/>
+      <w:numFmt w:val="bullet"/>
+      <w:lvlText w:val=""/>
+      <w:lvlJc w:val="left"/>
+      <w:pPr>
+        <w:tabs>
+          <w:tab w:val="num" w:pos="5040"/>
+        </w:tabs>
+        <w:ind w:left="5040" w:hanging="360"/>
+      </w:pPr>
+      <w:rPr>
+        <w:rFonts w:ascii="Wingdings" w:hAnsi="Wingdings" w:hint="default"/>
+        <w:sz w:val="20"/>
+      </w:rPr>
+    </w:lvl>
+    <w:lvl w:ilvl="7" w:tentative="1">
+      <w:start w:val="1"/>
+      <w:numFmt w:val="bullet"/>
+      <w:lvlText w:val=""/>
+      <w:lvlJc w:val="left"/>
+      <w:pPr>
+        <w:tabs>
+          <w:tab w:val="num" w:pos="5760"/>
+        </w:tabs>
+        <w:ind w:left="5760" w:hanging="360"/>
+      </w:pPr>
+      <w:rPr>
+        <w:rFonts w:ascii="Wingdings" w:hAnsi="Wingdings" w:hint="default"/>
+        <w:sz w:val="20"/>
+      </w:rPr>
+    </w:lvl>
+    <w:lvl w:ilvl="8" w:tentative="1">
+      <w:start w:val="1"/>
+      <w:numFmt w:val="bullet"/>
+      <w:lvlText w:val=""/>
+      <w:lvlJc w:val="left"/>
+      <w:pPr>
+        <w:tabs>
+          <w:tab w:val="num" w:pos="6480"/>
+        </w:tabs>
+        <w:ind w:left="6480" w:hanging="360"/>
+      </w:pPr>
+      <w:rPr>
+        <w:rFonts w:ascii="Wingdings" w:hAnsi="Wingdings" w:hint="default"/>
+        <w:sz w:val="20"/>
+      </w:rPr>
+    </w:lvl>
+  </w:abstractNum>
   <w:num w:numId="1" w16cid:durableId="1884632481">
     <w:abstractNumId w:val="0"/>
+  </w:num>
+  <w:num w:numId="2" w16cid:durableId="244536297">
+    <w:abstractNumId w:val="1"/>
   </w:num>
 </w:numbering>
 </file>

</xml_diff>

<commit_message>
Proje 5: Veri kalitesi raporları ve süreç denetim kodları tamamlandı
</commit_message>
<xml_diff>
--- a/BLM4522_Proje5/Proje5_Rapor.docx
+++ b/BLM4522_Proje5/Proje5_Rapor.docx
@@ -416,7 +416,7 @@
           <w:r>
             <w:fldChar w:fldCharType="separate"/>
           </w:r>
-          <w:hyperlink w:anchor="_Toc231395883" w:history="1">
+          <w:hyperlink w:anchor="_Toc231396072" w:history="1">
             <w:r>
               <w:rPr>
                 <w:rStyle w:val="Kpr"/>
@@ -443,7 +443,7 @@
                 <w:noProof/>
                 <w:webHidden/>
               </w:rPr>
-              <w:instrText xml:space="preserve"> PAGEREF _Toc231395883 \h </w:instrText>
+              <w:instrText xml:space="preserve"> PAGEREF _Toc231396072 \h </w:instrText>
             </w:r>
             <w:r>
               <w:rPr>
@@ -487,7 +487,7 @@
               <w14:ligatures w14:val="standardContextual"/>
             </w:rPr>
           </w:pPr>
-          <w:hyperlink w:anchor="_Toc231395884" w:history="1">
+          <w:hyperlink w:anchor="_Toc231396073" w:history="1">
             <w:r>
               <w:rPr>
                 <w:rStyle w:val="Kpr"/>
@@ -514,7 +514,7 @@
                 <w:noProof/>
                 <w:webHidden/>
               </w:rPr>
-              <w:instrText xml:space="preserve"> PAGEREF _Toc231395884 \h </w:instrText>
+              <w:instrText xml:space="preserve"> PAGEREF _Toc231396073 \h </w:instrText>
             </w:r>
             <w:r>
               <w:rPr>
@@ -558,7 +558,7 @@
               <w14:ligatures w14:val="standardContextual"/>
             </w:rPr>
           </w:pPr>
-          <w:hyperlink w:anchor="_Toc231395885" w:history="1">
+          <w:hyperlink w:anchor="_Toc231396074" w:history="1">
             <w:r>
               <w:rPr>
                 <w:rStyle w:val="Kpr"/>
@@ -585,7 +585,7 @@
                 <w:noProof/>
                 <w:webHidden/>
               </w:rPr>
-              <w:instrText xml:space="preserve"> PAGEREF _Toc231395885 \h </w:instrText>
+              <w:instrText xml:space="preserve"> PAGEREF _Toc231396074 \h </w:instrText>
             </w:r>
             <w:r>
               <w:rPr>
@@ -606,6 +606,77 @@
                 <w:webHidden/>
               </w:rPr>
               <w:t>4</w:t>
+            </w:r>
+            <w:r>
+              <w:rPr>
+                <w:noProof/>
+                <w:webHidden/>
+              </w:rPr>
+              <w:fldChar w:fldCharType="end"/>
+            </w:r>
+          </w:hyperlink>
+        </w:p>
+        <w:p>
+          <w:pPr>
+            <w:pStyle w:val="T2"/>
+            <w:rPr>
+              <w:rFonts w:asciiTheme="minorHAnsi" w:eastAsiaTheme="minorEastAsia" w:hAnsiTheme="minorHAnsi" w:cstheme="minorBidi"/>
+              <w:b w:val="0"/>
+              <w:noProof/>
+              <w:kern w:val="2"/>
+              <w:u w:val="none"/>
+              <w:lang w:eastAsia="tr-TR"/>
+              <w14:ligatures w14:val="standardContextual"/>
+            </w:rPr>
+          </w:pPr>
+          <w:hyperlink w:anchor="_Toc231396075" w:history="1">
+            <w:r>
+              <w:rPr>
+                <w:rStyle w:val="Kpr"/>
+                <w:noProof/>
+              </w:rPr>
+              <w:t>ADIM 3: Veri Kalitesi Raporlarının Oluşturulması ve Süreç Metrikleri</w:t>
+            </w:r>
+            <w:r>
+              <w:rPr>
+                <w:noProof/>
+                <w:webHidden/>
+              </w:rPr>
+              <w:tab/>
+            </w:r>
+            <w:r>
+              <w:rPr>
+                <w:noProof/>
+                <w:webHidden/>
+              </w:rPr>
+              <w:fldChar w:fldCharType="begin"/>
+            </w:r>
+            <w:r>
+              <w:rPr>
+                <w:noProof/>
+                <w:webHidden/>
+              </w:rPr>
+              <w:instrText xml:space="preserve"> PAGEREF _Toc231396075 \h </w:instrText>
+            </w:r>
+            <w:r>
+              <w:rPr>
+                <w:noProof/>
+                <w:webHidden/>
+              </w:rPr>
+            </w:r>
+            <w:r>
+              <w:rPr>
+                <w:noProof/>
+                <w:webHidden/>
+              </w:rPr>
+              <w:fldChar w:fldCharType="separate"/>
+            </w:r>
+            <w:r>
+              <w:rPr>
+                <w:noProof/>
+                <w:webHidden/>
+              </w:rPr>
+              <w:t>5</w:t>
             </w:r>
             <w:r>
               <w:rPr>
@@ -655,7 +726,7 @@
         <w:pStyle w:val="Balk1"/>
         <w:jc w:val="center"/>
       </w:pPr>
-      <w:bookmarkStart w:id="0" w:name="_Toc231395883"/>
+      <w:bookmarkStart w:id="0" w:name="_Toc231396072"/>
       <w:r>
         <w:lastRenderedPageBreak/>
         <w:t xml:space="preserve">Proje </w:t>
@@ -685,7 +756,7 @@
       <w:pPr>
         <w:pStyle w:val="Balk2"/>
       </w:pPr>
-      <w:bookmarkStart w:id="1" w:name="_Toc231395884"/>
+      <w:bookmarkStart w:id="1" w:name="_Toc231396073"/>
       <w:r>
         <w:t xml:space="preserve">Adım 1: </w:t>
       </w:r>
@@ -830,15 +901,12 @@
       <w:pPr>
         <w:pStyle w:val="Balk2"/>
       </w:pPr>
-      <w:bookmarkStart w:id="2" w:name="_Toc231395885"/>
+      <w:bookmarkStart w:id="2" w:name="_Toc231396074"/>
       <w:r>
         <w:t>Adım 2:</w:t>
       </w:r>
       <w:r>
-        <w:t xml:space="preserve"> </w:t>
-      </w:r>
-      <w:r>
-        <w:t>Veri Dönüştürme ve Hedef Sisteme Yükleme</w:t>
+        <w:t xml:space="preserve"> Veri Dönüştürme ve Hedef Sisteme Yükleme</w:t>
       </w:r>
       <w:bookmarkEnd w:id="2"/>
     </w:p>
@@ -916,6 +984,9 @@
     </w:p>
     <w:p>
       <w:r>
+        <w:rPr>
+          <w:noProof/>
+        </w:rPr>
         <w:drawing>
           <wp:inline distT="0" distB="0" distL="0" distR="0" wp14:anchorId="367A734D" wp14:editId="781608EF">
             <wp:extent cx="5257800" cy="2819670"/>
@@ -960,6 +1031,124 @@
     <w:p/>
     <w:p/>
     <w:p/>
+    <w:p>
+      <w:r>
+        <w:lastRenderedPageBreak/>
+        <w:t>03.06.2026</w:t>
+      </w:r>
+    </w:p>
+    <w:p>
+      <w:pPr>
+        <w:pStyle w:val="Balk2"/>
+      </w:pPr>
+      <w:bookmarkStart w:id="3" w:name="_Toc231396075"/>
+      <w:r>
+        <w:t>ADIM 3: Veri Kalitesi Raporlarının Oluşturulması ve Süreç Metrikleri</w:t>
+      </w:r>
+      <w:bookmarkEnd w:id="3"/>
+    </w:p>
+    <w:p>
+      <w:r>
+        <w:t>V</w:t>
+      </w:r>
+      <w:r>
+        <w:t xml:space="preserve">eri temizleme ve dönüştürme süreçlerinin doğrulanması amacıyla T-SQL tabanlı bir veri kalitesi (Data </w:t>
+      </w:r>
+      <w:proofErr w:type="spellStart"/>
+      <w:r>
+        <w:t>Quality</w:t>
+      </w:r>
+      <w:proofErr w:type="spellEnd"/>
+      <w:r>
+        <w:t>) raporlama mekanizması devreye alınmıştır. Bu denetim süreciyle, kaynak sistem ile veri ambarı arasındaki mutabakat doğrulanmaktadır.</w:t>
+      </w:r>
+    </w:p>
+    <w:p>
+      <w:pPr>
+        <w:numPr>
+          <w:ilvl w:val="0"/>
+          <w:numId w:val="3"/>
+        </w:numPr>
+      </w:pPr>
+      <w:proofErr w:type="spellStart"/>
+      <w:r>
+        <w:t>Person.PersonPhone</w:t>
+      </w:r>
+      <w:proofErr w:type="spellEnd"/>
+      <w:r>
+        <w:t xml:space="preserve"> kaynak tablosundaki toplam girdi sayısı ile </w:t>
+      </w:r>
+      <w:proofErr w:type="spellStart"/>
+      <w:r>
+        <w:t>ETL_Clean_People</w:t>
+      </w:r>
+      <w:proofErr w:type="spellEnd"/>
+      <w:r>
+        <w:t xml:space="preserve"> hedef tablosuna yüklenen temizlenmiş satır sayıları anlık olarak karşılaştırılmıştır.</w:t>
+      </w:r>
+    </w:p>
+    <w:p>
+      <w:pPr>
+        <w:numPr>
+          <w:ilvl w:val="0"/>
+          <w:numId w:val="3"/>
+        </w:numPr>
+      </w:pPr>
+      <w:r>
+        <w:t>Yapılan analiz sonucunda, ETL sürecinin %100 başarı oranıyla tamamlandığı ve aktarım esnasında herhangi bir veri kaybı veya sistemsel hata oluşmadığı resmi olarak saptanmıştır.</w:t>
+      </w:r>
+    </w:p>
+    <w:p>
+      <w:pPr>
+        <w:numPr>
+          <w:ilvl w:val="0"/>
+          <w:numId w:val="3"/>
+        </w:numPr>
+      </w:pPr>
+      <w:r>
+        <w:t>Geliştirilen bu proaktif raporlama altyapısı sayesinde, büyük veri kümeleri işlenirken oluşabilecek senkronizasyon hataları anında tespit edilmekte ve kurumsal veri bütünlüğü güvence altına alınmaktadır.</w:t>
+      </w:r>
+    </w:p>
+    <w:p>
+      <w:r>
+        <w:drawing>
+          <wp:inline distT="0" distB="0" distL="0" distR="0" wp14:anchorId="3E4A41ED" wp14:editId="5A36DCD0">
+            <wp:extent cx="5944689" cy="982980"/>
+            <wp:effectExtent l="0" t="0" r="0" b="7620"/>
+            <wp:docPr id="1961667690" name="Resim 1" descr="metin, ekran görüntüsü, çizgi, yazı tipi içeren bir resim&#10;&#10;Yapay zeka tarafından oluşturulmuş içerik yanlış olabilir."/>
+            <wp:cNvGraphicFramePr>
+              <a:graphicFrameLocks xmlns:a="http://schemas.openxmlformats.org/drawingml/2006/main" noChangeAspect="1"/>
+            </wp:cNvGraphicFramePr>
+            <a:graphic xmlns:a="http://schemas.openxmlformats.org/drawingml/2006/main">
+              <a:graphicData uri="http://schemas.openxmlformats.org/drawingml/2006/picture">
+                <pic:pic xmlns:pic="http://schemas.openxmlformats.org/drawingml/2006/picture">
+                  <pic:nvPicPr>
+                    <pic:cNvPr id="1961667690" name="Resim 1" descr="metin, ekran görüntüsü, çizgi, yazı tipi içeren bir resim&#10;&#10;Yapay zeka tarafından oluşturulmuş içerik yanlış olabilir."/>
+                    <pic:cNvPicPr/>
+                  </pic:nvPicPr>
+                  <pic:blipFill>
+                    <a:blip r:embed="rId8"/>
+                    <a:stretch>
+                      <a:fillRect/>
+                    </a:stretch>
+                  </pic:blipFill>
+                  <pic:spPr>
+                    <a:xfrm>
+                      <a:off x="0" y="0"/>
+                      <a:ext cx="5949465" cy="983770"/>
+                    </a:xfrm>
+                    <a:prstGeom prst="rect">
+                      <a:avLst/>
+                    </a:prstGeom>
+                  </pic:spPr>
+                </pic:pic>
+              </a:graphicData>
+            </a:graphic>
+          </wp:inline>
+        </w:drawing>
+      </w:r>
+    </w:p>
+    <w:p/>
     <w:sectPr>
       <w:pgSz w:w="11906" w:h="16838"/>
       <w:pgMar w:top="1417" w:right="1417" w:bottom="1417" w:left="1417" w:header="708" w:footer="708" w:gutter="0"/>
@@ -1122,9 +1311,9 @@
     </w:lvl>
   </w:abstractNum>
   <w:abstractNum w:abstractNumId="1" w15:restartNumberingAfterBreak="0">
-    <w:nsid w:val="5174145C"/>
+    <w:nsid w:val="27CF6182"/>
     <w:multiLevelType w:val="multilevel"/>
-    <w:tmpl w:val="784EB6AA"/>
+    <w:tmpl w:val="E766C4E4"/>
     <w:lvl w:ilvl="0">
       <w:start w:val="1"/>
       <w:numFmt w:val="bullet"/>
@@ -1270,10 +1459,162 @@
       </w:rPr>
     </w:lvl>
   </w:abstractNum>
+  <w:abstractNum w:abstractNumId="2" w15:restartNumberingAfterBreak="0">
+    <w:nsid w:val="5174145C"/>
+    <w:multiLevelType w:val="multilevel"/>
+    <w:tmpl w:val="784EB6AA"/>
+    <w:lvl w:ilvl="0">
+      <w:start w:val="1"/>
+      <w:numFmt w:val="bullet"/>
+      <w:lvlText w:val=""/>
+      <w:lvlJc w:val="left"/>
+      <w:pPr>
+        <w:tabs>
+          <w:tab w:val="num" w:pos="720"/>
+        </w:tabs>
+        <w:ind w:left="720" w:hanging="360"/>
+      </w:pPr>
+      <w:rPr>
+        <w:rFonts w:ascii="Symbol" w:hAnsi="Symbol" w:hint="default"/>
+        <w:sz w:val="20"/>
+      </w:rPr>
+    </w:lvl>
+    <w:lvl w:ilvl="1" w:tentative="1">
+      <w:start w:val="1"/>
+      <w:numFmt w:val="bullet"/>
+      <w:lvlText w:val="o"/>
+      <w:lvlJc w:val="left"/>
+      <w:pPr>
+        <w:tabs>
+          <w:tab w:val="num" w:pos="1440"/>
+        </w:tabs>
+        <w:ind w:left="1440" w:hanging="360"/>
+      </w:pPr>
+      <w:rPr>
+        <w:rFonts w:ascii="Courier New" w:hAnsi="Courier New" w:hint="default"/>
+        <w:sz w:val="20"/>
+      </w:rPr>
+    </w:lvl>
+    <w:lvl w:ilvl="2" w:tentative="1">
+      <w:start w:val="1"/>
+      <w:numFmt w:val="bullet"/>
+      <w:lvlText w:val=""/>
+      <w:lvlJc w:val="left"/>
+      <w:pPr>
+        <w:tabs>
+          <w:tab w:val="num" w:pos="2160"/>
+        </w:tabs>
+        <w:ind w:left="2160" w:hanging="360"/>
+      </w:pPr>
+      <w:rPr>
+        <w:rFonts w:ascii="Wingdings" w:hAnsi="Wingdings" w:hint="default"/>
+        <w:sz w:val="20"/>
+      </w:rPr>
+    </w:lvl>
+    <w:lvl w:ilvl="3" w:tentative="1">
+      <w:start w:val="1"/>
+      <w:numFmt w:val="bullet"/>
+      <w:lvlText w:val=""/>
+      <w:lvlJc w:val="left"/>
+      <w:pPr>
+        <w:tabs>
+          <w:tab w:val="num" w:pos="2880"/>
+        </w:tabs>
+        <w:ind w:left="2880" w:hanging="360"/>
+      </w:pPr>
+      <w:rPr>
+        <w:rFonts w:ascii="Wingdings" w:hAnsi="Wingdings" w:hint="default"/>
+        <w:sz w:val="20"/>
+      </w:rPr>
+    </w:lvl>
+    <w:lvl w:ilvl="4" w:tentative="1">
+      <w:start w:val="1"/>
+      <w:numFmt w:val="bullet"/>
+      <w:lvlText w:val=""/>
+      <w:lvlJc w:val="left"/>
+      <w:pPr>
+        <w:tabs>
+          <w:tab w:val="num" w:pos="3600"/>
+        </w:tabs>
+        <w:ind w:left="3600" w:hanging="360"/>
+      </w:pPr>
+      <w:rPr>
+        <w:rFonts w:ascii="Wingdings" w:hAnsi="Wingdings" w:hint="default"/>
+        <w:sz w:val="20"/>
+      </w:rPr>
+    </w:lvl>
+    <w:lvl w:ilvl="5" w:tentative="1">
+      <w:start w:val="1"/>
+      <w:numFmt w:val="bullet"/>
+      <w:lvlText w:val=""/>
+      <w:lvlJc w:val="left"/>
+      <w:pPr>
+        <w:tabs>
+          <w:tab w:val="num" w:pos="4320"/>
+        </w:tabs>
+        <w:ind w:left="4320" w:hanging="360"/>
+      </w:pPr>
+      <w:rPr>
+        <w:rFonts w:ascii="Wingdings" w:hAnsi="Wingdings" w:hint="default"/>
+        <w:sz w:val="20"/>
+      </w:rPr>
+    </w:lvl>
+    <w:lvl w:ilvl="6" w:tentative="1">
+      <w:start w:val="1"/>
+      <w:numFmt w:val="bullet"/>
+      <w:lvlText w:val=""/>
+      <w:lvlJc w:val="left"/>
+      <w:pPr>
+        <w:tabs>
+          <w:tab w:val="num" w:pos="5040"/>
+        </w:tabs>
+        <w:ind w:left="5040" w:hanging="360"/>
+      </w:pPr>
+      <w:rPr>
+        <w:rFonts w:ascii="Wingdings" w:hAnsi="Wingdings" w:hint="default"/>
+        <w:sz w:val="20"/>
+      </w:rPr>
+    </w:lvl>
+    <w:lvl w:ilvl="7" w:tentative="1">
+      <w:start w:val="1"/>
+      <w:numFmt w:val="bullet"/>
+      <w:lvlText w:val=""/>
+      <w:lvlJc w:val="left"/>
+      <w:pPr>
+        <w:tabs>
+          <w:tab w:val="num" w:pos="5760"/>
+        </w:tabs>
+        <w:ind w:left="5760" w:hanging="360"/>
+      </w:pPr>
+      <w:rPr>
+        <w:rFonts w:ascii="Wingdings" w:hAnsi="Wingdings" w:hint="default"/>
+        <w:sz w:val="20"/>
+      </w:rPr>
+    </w:lvl>
+    <w:lvl w:ilvl="8" w:tentative="1">
+      <w:start w:val="1"/>
+      <w:numFmt w:val="bullet"/>
+      <w:lvlText w:val=""/>
+      <w:lvlJc w:val="left"/>
+      <w:pPr>
+        <w:tabs>
+          <w:tab w:val="num" w:pos="6480"/>
+        </w:tabs>
+        <w:ind w:left="6480" w:hanging="360"/>
+      </w:pPr>
+      <w:rPr>
+        <w:rFonts w:ascii="Wingdings" w:hAnsi="Wingdings" w:hint="default"/>
+        <w:sz w:val="20"/>
+      </w:rPr>
+    </w:lvl>
+  </w:abstractNum>
   <w:num w:numId="1" w16cid:durableId="1884632481">
     <w:abstractNumId w:val="0"/>
   </w:num>
   <w:num w:numId="2" w16cid:durableId="244536297">
+    <w:abstractNumId w:val="2"/>
+  </w:num>
+  <w:num w:numId="3" w16cid:durableId="2012217680">
     <w:abstractNumId w:val="1"/>
   </w:num>
 </w:numbering>

</xml_diff>

<commit_message>
Proje 5: ETL aykırı veri yönetimi ve hata günlüğü altyapısı eklendi
</commit_message>
<xml_diff>
--- a/BLM4522_Proje5/Proje5_Rapor.docx
+++ b/BLM4522_Proje5/Proje5_Rapor.docx
@@ -416,7 +416,7 @@
           <w:r>
             <w:fldChar w:fldCharType="separate"/>
           </w:r>
-          <w:hyperlink w:anchor="_Toc231396072" w:history="1">
+          <w:hyperlink w:anchor="_Toc231396391" w:history="1">
             <w:r>
               <w:rPr>
                 <w:rStyle w:val="Kpr"/>
@@ -443,7 +443,7 @@
                 <w:noProof/>
                 <w:webHidden/>
               </w:rPr>
-              <w:instrText xml:space="preserve"> PAGEREF _Toc231396072 \h </w:instrText>
+              <w:instrText xml:space="preserve"> PAGEREF _Toc231396391 \h </w:instrText>
             </w:r>
             <w:r>
               <w:rPr>
@@ -487,7 +487,7 @@
               <w14:ligatures w14:val="standardContextual"/>
             </w:rPr>
           </w:pPr>
-          <w:hyperlink w:anchor="_Toc231396073" w:history="1">
+          <w:hyperlink w:anchor="_Toc231396392" w:history="1">
             <w:r>
               <w:rPr>
                 <w:rStyle w:val="Kpr"/>
@@ -514,7 +514,7 @@
                 <w:noProof/>
                 <w:webHidden/>
               </w:rPr>
-              <w:instrText xml:space="preserve"> PAGEREF _Toc231396073 \h </w:instrText>
+              <w:instrText xml:space="preserve"> PAGEREF _Toc231396392 \h </w:instrText>
             </w:r>
             <w:r>
               <w:rPr>
@@ -558,7 +558,7 @@
               <w14:ligatures w14:val="standardContextual"/>
             </w:rPr>
           </w:pPr>
-          <w:hyperlink w:anchor="_Toc231396074" w:history="1">
+          <w:hyperlink w:anchor="_Toc231396393" w:history="1">
             <w:r>
               <w:rPr>
                 <w:rStyle w:val="Kpr"/>
@@ -585,7 +585,7 @@
                 <w:noProof/>
                 <w:webHidden/>
               </w:rPr>
-              <w:instrText xml:space="preserve"> PAGEREF _Toc231396074 \h </w:instrText>
+              <w:instrText xml:space="preserve"> PAGEREF _Toc231396393 \h </w:instrText>
             </w:r>
             <w:r>
               <w:rPr>
@@ -629,7 +629,7 @@
               <w14:ligatures w14:val="standardContextual"/>
             </w:rPr>
           </w:pPr>
-          <w:hyperlink w:anchor="_Toc231396075" w:history="1">
+          <w:hyperlink w:anchor="_Toc231396394" w:history="1">
             <w:r>
               <w:rPr>
                 <w:rStyle w:val="Kpr"/>
@@ -656,7 +656,7 @@
                 <w:noProof/>
                 <w:webHidden/>
               </w:rPr>
-              <w:instrText xml:space="preserve"> PAGEREF _Toc231396075 \h </w:instrText>
+              <w:instrText xml:space="preserve"> PAGEREF _Toc231396394 \h </w:instrText>
             </w:r>
             <w:r>
               <w:rPr>
@@ -677,6 +677,77 @@
                 <w:webHidden/>
               </w:rPr>
               <w:t>5</w:t>
+            </w:r>
+            <w:r>
+              <w:rPr>
+                <w:noProof/>
+                <w:webHidden/>
+              </w:rPr>
+              <w:fldChar w:fldCharType="end"/>
+            </w:r>
+          </w:hyperlink>
+        </w:p>
+        <w:p>
+          <w:pPr>
+            <w:pStyle w:val="T2"/>
+            <w:rPr>
+              <w:rFonts w:asciiTheme="minorHAnsi" w:eastAsiaTheme="minorEastAsia" w:hAnsiTheme="minorHAnsi" w:cstheme="minorBidi"/>
+              <w:b w:val="0"/>
+              <w:noProof/>
+              <w:kern w:val="2"/>
+              <w:u w:val="none"/>
+              <w:lang w:eastAsia="tr-TR"/>
+              <w14:ligatures w14:val="standardContextual"/>
+            </w:rPr>
+          </w:pPr>
+          <w:hyperlink w:anchor="_Toc231396395" w:history="1">
+            <w:r>
+              <w:rPr>
+                <w:rStyle w:val="Kpr"/>
+                <w:noProof/>
+              </w:rPr>
+              <w:t>ADIM 4: Aykırı Veri Yönetimi ve Hata Günlüğü</w:t>
+            </w:r>
+            <w:r>
+              <w:rPr>
+                <w:noProof/>
+                <w:webHidden/>
+              </w:rPr>
+              <w:tab/>
+            </w:r>
+            <w:r>
+              <w:rPr>
+                <w:noProof/>
+                <w:webHidden/>
+              </w:rPr>
+              <w:fldChar w:fldCharType="begin"/>
+            </w:r>
+            <w:r>
+              <w:rPr>
+                <w:noProof/>
+                <w:webHidden/>
+              </w:rPr>
+              <w:instrText xml:space="preserve"> PAGEREF _Toc231396395 \h </w:instrText>
+            </w:r>
+            <w:r>
+              <w:rPr>
+                <w:noProof/>
+                <w:webHidden/>
+              </w:rPr>
+            </w:r>
+            <w:r>
+              <w:rPr>
+                <w:noProof/>
+                <w:webHidden/>
+              </w:rPr>
+              <w:fldChar w:fldCharType="separate"/>
+            </w:r>
+            <w:r>
+              <w:rPr>
+                <w:noProof/>
+                <w:webHidden/>
+              </w:rPr>
+              <w:t>6</w:t>
             </w:r>
             <w:r>
               <w:rPr>
@@ -726,9 +797,8 @@
         <w:pStyle w:val="Balk1"/>
         <w:jc w:val="center"/>
       </w:pPr>
-      <w:bookmarkStart w:id="0" w:name="_Toc231396072"/>
-      <w:r>
-        <w:lastRenderedPageBreak/>
+      <w:bookmarkStart w:id="0" w:name="_Toc231396391"/>
+      <w:r>
         <w:t xml:space="preserve">Proje </w:t>
       </w:r>
       <w:proofErr w:type="gramStart"/>
@@ -756,7 +826,7 @@
       <w:pPr>
         <w:pStyle w:val="Balk2"/>
       </w:pPr>
-      <w:bookmarkStart w:id="1" w:name="_Toc231396073"/>
+      <w:bookmarkStart w:id="1" w:name="_Toc231396392"/>
       <w:r>
         <w:t xml:space="preserve">Adım 1: </w:t>
       </w:r>
@@ -901,7 +971,7 @@
       <w:pPr>
         <w:pStyle w:val="Balk2"/>
       </w:pPr>
-      <w:bookmarkStart w:id="2" w:name="_Toc231396074"/>
+      <w:bookmarkStart w:id="2" w:name="_Toc231396393"/>
       <w:r>
         <w:t>Adım 2:</w:t>
       </w:r>
@@ -1033,7 +1103,6 @@
     <w:p/>
     <w:p>
       <w:r>
-        <w:lastRenderedPageBreak/>
         <w:t>03.06.2026</w:t>
       </w:r>
     </w:p>
@@ -1041,7 +1110,7 @@
       <w:pPr>
         <w:pStyle w:val="Balk2"/>
       </w:pPr>
-      <w:bookmarkStart w:id="3" w:name="_Toc231396075"/>
+      <w:bookmarkStart w:id="3" w:name="_Toc231396394"/>
       <w:r>
         <w:t>ADIM 3: Veri Kalitesi Raporlarının Oluşturulması ve Süreç Metrikleri</w:t>
       </w:r>
@@ -1111,6 +1180,9 @@
     </w:p>
     <w:p>
       <w:r>
+        <w:rPr>
+          <w:noProof/>
+        </w:rPr>
         <w:drawing>
           <wp:inline distT="0" distB="0" distL="0" distR="0" wp14:anchorId="3E4A41ED" wp14:editId="5A36DCD0">
             <wp:extent cx="5944689" cy="982980"/>
@@ -1149,6 +1221,135 @@
       </w:r>
     </w:p>
     <w:p/>
+    <w:p/>
+    <w:p/>
+    <w:p/>
+    <w:p/>
+    <w:p/>
+    <w:p/>
+    <w:p/>
+    <w:p/>
+    <w:p/>
+    <w:p/>
+    <w:p/>
+    <w:p/>
+    <w:p>
+      <w:r>
+        <w:t>03.06.2026</w:t>
+      </w:r>
+    </w:p>
+    <w:p>
+      <w:pPr>
+        <w:pStyle w:val="Balk2"/>
+      </w:pPr>
+      <w:bookmarkStart w:id="4" w:name="_Toc231396395"/>
+      <w:r>
+        <w:t>ADIM 4: Aykırı Veri Yönetimi ve Hata Günlüğü</w:t>
+      </w:r>
+      <w:bookmarkEnd w:id="4"/>
+    </w:p>
+    <w:p>
+      <w:r>
+        <w:t>ETL süreçlerinin kararlılığını (</w:t>
+      </w:r>
+      <w:proofErr w:type="spellStart"/>
+      <w:r>
+        <w:t>robustness</w:t>
+      </w:r>
+      <w:proofErr w:type="spellEnd"/>
+      <w:r>
+        <w:t xml:space="preserve">) artırmak ve hedef ambar yapısının veri kalitesini korumak amacıyla bir istisna yönetim katmanı tasarlanmıştır. Bu kapsamda, temizleme filtrelerine uymayan aykırı verilerin izole edilmesi için </w:t>
+      </w:r>
+      <w:proofErr w:type="spellStart"/>
+      <w:r>
+        <w:t>ETL_Error_Log</w:t>
+      </w:r>
+      <w:proofErr w:type="spellEnd"/>
+      <w:r>
+        <w:t xml:space="preserve"> adında bir hata günlüğü tablosu sisteme dahil edilmiştir.</w:t>
+      </w:r>
+    </w:p>
+    <w:p>
+      <w:pPr>
+        <w:numPr>
+          <w:ilvl w:val="0"/>
+          <w:numId w:val="4"/>
+        </w:numPr>
+      </w:pPr>
+      <w:r>
+        <w:t>Karakter temizleme işleminden geçirildikten sonra bile uzunluğu kurumsal standartların (10 hanenin) altında kalan kusurlu telefon numaraları dinamik olarak tespit edilmiştir.</w:t>
+      </w:r>
+    </w:p>
+    <w:p>
+      <w:pPr>
+        <w:numPr>
+          <w:ilvl w:val="0"/>
+          <w:numId w:val="4"/>
+        </w:numPr>
+      </w:pPr>
+      <w:r>
+        <w:t xml:space="preserve">Tespit edilen bu aykırı kayıtlar, ana ambar tablosunu kirletmemesi adına otomatik olarak </w:t>
+      </w:r>
+      <w:proofErr w:type="spellStart"/>
+      <w:r>
+        <w:t>ETL_Error_Log</w:t>
+      </w:r>
+      <w:proofErr w:type="spellEnd"/>
+      <w:r>
+        <w:t xml:space="preserve"> tablosuna yönlendirilmiş ve süreç güvenliği sağlanmaktadır.</w:t>
+      </w:r>
+    </w:p>
+    <w:p>
+      <w:pPr>
+        <w:numPr>
+          <w:ilvl w:val="0"/>
+          <w:numId w:val="4"/>
+        </w:numPr>
+      </w:pPr>
+      <w:r>
+        <w:t>Bu mekanizma sayesinde, veri kalitesi süreçlerinde insan müdahalesine gerek kalmaksızın hatalı girdilerin takibi ve raporlaması otomatik olarak yapılmaktadır.</w:t>
+      </w:r>
+    </w:p>
+    <w:p>
+      <w:r>
+        <w:drawing>
+          <wp:inline distT="0" distB="0" distL="0" distR="0" wp14:anchorId="35FA03F0" wp14:editId="1BAFA7BA">
+            <wp:extent cx="5600700" cy="1082880"/>
+            <wp:effectExtent l="0" t="0" r="0" b="3175"/>
+            <wp:docPr id="93392970" name="Resim 1" descr="metin, ekran görüntüsü, yazı tipi, çizgi içeren bir resim&#10;&#10;Yapay zeka tarafından oluşturulmuş içerik yanlış olabilir."/>
+            <wp:cNvGraphicFramePr>
+              <a:graphicFrameLocks xmlns:a="http://schemas.openxmlformats.org/drawingml/2006/main" noChangeAspect="1"/>
+            </wp:cNvGraphicFramePr>
+            <a:graphic xmlns:a="http://schemas.openxmlformats.org/drawingml/2006/main">
+              <a:graphicData uri="http://schemas.openxmlformats.org/drawingml/2006/picture">
+                <pic:pic xmlns:pic="http://schemas.openxmlformats.org/drawingml/2006/picture">
+                  <pic:nvPicPr>
+                    <pic:cNvPr id="93392970" name="Resim 1" descr="metin, ekran görüntüsü, yazı tipi, çizgi içeren bir resim&#10;&#10;Yapay zeka tarafından oluşturulmuş içerik yanlış olabilir."/>
+                    <pic:cNvPicPr/>
+                  </pic:nvPicPr>
+                  <pic:blipFill>
+                    <a:blip r:embed="rId9"/>
+                    <a:stretch>
+                      <a:fillRect/>
+                    </a:stretch>
+                  </pic:blipFill>
+                  <pic:spPr>
+                    <a:xfrm>
+                      <a:off x="0" y="0"/>
+                      <a:ext cx="5644691" cy="1091386"/>
+                    </a:xfrm>
+                    <a:prstGeom prst="rect">
+                      <a:avLst/>
+                    </a:prstGeom>
+                  </pic:spPr>
+                </pic:pic>
+              </a:graphicData>
+            </a:graphic>
+          </wp:inline>
+        </w:drawing>
+      </w:r>
+    </w:p>
+    <w:p/>
     <w:sectPr>
       <w:pgSz w:w="11906" w:h="16838"/>
       <w:pgMar w:top="1417" w:right="1417" w:bottom="1417" w:left="1417" w:header="708" w:footer="708" w:gutter="0"/>
@@ -1162,6 +1363,155 @@
 <file path=word/numbering.xml><?xml version="1.0" encoding="utf-8"?>
 <w:numbering xmlns:wpc="http://schemas.microsoft.com/office/word/2010/wordprocessingCanvas" xmlns:cx="http://schemas.microsoft.com/office/drawing/2014/chartex" xmlns:cx1="http://schemas.microsoft.com/office/drawing/2015/9/8/chartex" xmlns:cx2="http://schemas.microsoft.com/office/drawing/2015/10/21/chartex" xmlns:cx3="http://schemas.microsoft.com/office/drawing/2016/5/9/chartex" xmlns:cx4="http://schemas.microsoft.com/office/drawing/2016/5/10/chartex" xmlns:cx5="http://schemas.microsoft.com/office/drawing/2016/5/11/chartex" xmlns:cx6="http://schemas.microsoft.com/office/drawing/2016/5/12/chartex" xmlns:cx7="http://schemas.microsoft.com/office/drawing/2016/5/13/chartex" xmlns:cx8="http://schemas.microsoft.com/office/drawing/2016/5/14/chartex" xmlns:mc="http://schemas.openxmlformats.org/markup-compatibility/2006" xmlns:aink="http://schemas.microsoft.com/office/drawing/2016/ink" xmlns:am3d="http://schemas.microsoft.com/office/drawing/2017/model3d" xmlns:o="urn:schemas-microsoft-com:office:office" xmlns:oel="http://schemas.microsoft.com/office/2019/extlst" xmlns:r="http://schemas.openxmlformats.org/officeDocument/2006/relationships" xmlns:m="http://schemas.openxmlformats.org/officeDocument/2006/math" xmlns:v="urn:schemas-microsoft-com:vml" xmlns:wp14="http://schemas.microsoft.com/office/word/2010/wordprocessingDrawing" xmlns:wp="http://schemas.openxmlformats.org/drawingml/2006/wordprocessingDrawing" xmlns:w10="urn:schemas-microsoft-com:office:word" xmlns:w="http://schemas.openxmlformats.org/wordprocessingml/2006/main" xmlns:w14="http://schemas.microsoft.com/office/word/2010/wordml" xmlns:w15="http://schemas.microsoft.com/office/word/2012/wordml" xmlns:w16cex="http://schemas.microsoft.com/office/word/2018/wordml/cex" xmlns:w16cid="http://schemas.microsoft.com/office/word/2016/wordml/cid" xmlns:w16="http://schemas.microsoft.com/office/word/2018/wordml" xmlns:w16du="http://schemas.microsoft.com/office/word/2023/wordml/word16du" xmlns:w16sdtdh="http://schemas.microsoft.com/office/word/2020/wordml/sdtdatahash" xmlns:w16sdtfl="http://schemas.microsoft.com/office/word/2024/wordml/sdtformatlock" xmlns:w16se="http://schemas.microsoft.com/office/word/2015/wordml/symex" xmlns:wpg="http://schemas.microsoft.com/office/word/2010/wordprocessingGroup" xmlns:wpi="http://schemas.microsoft.com/office/word/2010/wordprocessingInk" xmlns:wne="http://schemas.microsoft.com/office/word/2006/wordml" xmlns:wps="http://schemas.microsoft.com/office/word/2010/wordprocessingShape" mc:Ignorable="w14 w15 w16se w16cid w16 w16cex w16sdtdh w16sdtfl w16du wp14">
   <w:abstractNum w:abstractNumId="0" w15:restartNumberingAfterBreak="0">
+    <w:nsid w:val="0FBE21E7"/>
+    <w:multiLevelType w:val="multilevel"/>
+    <w:tmpl w:val="AC42DB82"/>
+    <w:lvl w:ilvl="0">
+      <w:start w:val="1"/>
+      <w:numFmt w:val="bullet"/>
+      <w:lvlText w:val=""/>
+      <w:lvlJc w:val="left"/>
+      <w:pPr>
+        <w:tabs>
+          <w:tab w:val="num" w:pos="720"/>
+        </w:tabs>
+        <w:ind w:left="720" w:hanging="360"/>
+      </w:pPr>
+      <w:rPr>
+        <w:rFonts w:ascii="Symbol" w:hAnsi="Symbol" w:hint="default"/>
+        <w:sz w:val="20"/>
+      </w:rPr>
+    </w:lvl>
+    <w:lvl w:ilvl="1" w:tentative="1">
+      <w:start w:val="1"/>
+      <w:numFmt w:val="bullet"/>
+      <w:lvlText w:val="o"/>
+      <w:lvlJc w:val="left"/>
+      <w:pPr>
+        <w:tabs>
+          <w:tab w:val="num" w:pos="1440"/>
+        </w:tabs>
+        <w:ind w:left="1440" w:hanging="360"/>
+      </w:pPr>
+      <w:rPr>
+        <w:rFonts w:ascii="Courier New" w:hAnsi="Courier New" w:hint="default"/>
+        <w:sz w:val="20"/>
+      </w:rPr>
+    </w:lvl>
+    <w:lvl w:ilvl="2" w:tentative="1">
+      <w:start w:val="1"/>
+      <w:numFmt w:val="bullet"/>
+      <w:lvlText w:val=""/>
+      <w:lvlJc w:val="left"/>
+      <w:pPr>
+        <w:tabs>
+          <w:tab w:val="num" w:pos="2160"/>
+        </w:tabs>
+        <w:ind w:left="2160" w:hanging="360"/>
+      </w:pPr>
+      <w:rPr>
+        <w:rFonts w:ascii="Wingdings" w:hAnsi="Wingdings" w:hint="default"/>
+        <w:sz w:val="20"/>
+      </w:rPr>
+    </w:lvl>
+    <w:lvl w:ilvl="3" w:tentative="1">
+      <w:start w:val="1"/>
+      <w:numFmt w:val="bullet"/>
+      <w:lvlText w:val=""/>
+      <w:lvlJc w:val="left"/>
+      <w:pPr>
+        <w:tabs>
+          <w:tab w:val="num" w:pos="2880"/>
+        </w:tabs>
+        <w:ind w:left="2880" w:hanging="360"/>
+      </w:pPr>
+      <w:rPr>
+        <w:rFonts w:ascii="Wingdings" w:hAnsi="Wingdings" w:hint="default"/>
+        <w:sz w:val="20"/>
+      </w:rPr>
+    </w:lvl>
+    <w:lvl w:ilvl="4" w:tentative="1">
+      <w:start w:val="1"/>
+      <w:numFmt w:val="bullet"/>
+      <w:lvlText w:val=""/>
+      <w:lvlJc w:val="left"/>
+      <w:pPr>
+        <w:tabs>
+          <w:tab w:val="num" w:pos="3600"/>
+        </w:tabs>
+        <w:ind w:left="3600" w:hanging="360"/>
+      </w:pPr>
+      <w:rPr>
+        <w:rFonts w:ascii="Wingdings" w:hAnsi="Wingdings" w:hint="default"/>
+        <w:sz w:val="20"/>
+      </w:rPr>
+    </w:lvl>
+    <w:lvl w:ilvl="5" w:tentative="1">
+      <w:start w:val="1"/>
+      <w:numFmt w:val="bullet"/>
+      <w:lvlText w:val=""/>
+      <w:lvlJc w:val="left"/>
+      <w:pPr>
+        <w:tabs>
+          <w:tab w:val="num" w:pos="4320"/>
+        </w:tabs>
+        <w:ind w:left="4320" w:hanging="360"/>
+      </w:pPr>
+      <w:rPr>
+        <w:rFonts w:ascii="Wingdings" w:hAnsi="Wingdings" w:hint="default"/>
+        <w:sz w:val="20"/>
+      </w:rPr>
+    </w:lvl>
+    <w:lvl w:ilvl="6" w:tentative="1">
+      <w:start w:val="1"/>
+      <w:numFmt w:val="bullet"/>
+      <w:lvlText w:val=""/>
+      <w:lvlJc w:val="left"/>
+      <w:pPr>
+        <w:tabs>
+          <w:tab w:val="num" w:pos="5040"/>
+        </w:tabs>
+        <w:ind w:left="5040" w:hanging="360"/>
+      </w:pPr>
+      <w:rPr>
+        <w:rFonts w:ascii="Wingdings" w:hAnsi="Wingdings" w:hint="default"/>
+        <w:sz w:val="20"/>
+      </w:rPr>
+    </w:lvl>
+    <w:lvl w:ilvl="7" w:tentative="1">
+      <w:start w:val="1"/>
+      <w:numFmt w:val="bullet"/>
+      <w:lvlText w:val=""/>
+      <w:lvlJc w:val="left"/>
+      <w:pPr>
+        <w:tabs>
+          <w:tab w:val="num" w:pos="5760"/>
+        </w:tabs>
+        <w:ind w:left="5760" w:hanging="360"/>
+      </w:pPr>
+      <w:rPr>
+        <w:rFonts w:ascii="Wingdings" w:hAnsi="Wingdings" w:hint="default"/>
+        <w:sz w:val="20"/>
+      </w:rPr>
+    </w:lvl>
+    <w:lvl w:ilvl="8" w:tentative="1">
+      <w:start w:val="1"/>
+      <w:numFmt w:val="bullet"/>
+      <w:lvlText w:val=""/>
+      <w:lvlJc w:val="left"/>
+      <w:pPr>
+        <w:tabs>
+          <w:tab w:val="num" w:pos="6480"/>
+        </w:tabs>
+        <w:ind w:left="6480" w:hanging="360"/>
+      </w:pPr>
+      <w:rPr>
+        <w:rFonts w:ascii="Wingdings" w:hAnsi="Wingdings" w:hint="default"/>
+        <w:sz w:val="20"/>
+      </w:rPr>
+    </w:lvl>
+  </w:abstractNum>
+  <w:abstractNum w:abstractNumId="1" w15:restartNumberingAfterBreak="0">
     <w:nsid w:val="1608722E"/>
     <w:multiLevelType w:val="multilevel"/>
     <w:tmpl w:val="5DD06EC4"/>
@@ -1310,7 +1660,7 @@
       </w:rPr>
     </w:lvl>
   </w:abstractNum>
-  <w:abstractNum w:abstractNumId="1" w15:restartNumberingAfterBreak="0">
+  <w:abstractNum w:abstractNumId="2" w15:restartNumberingAfterBreak="0">
     <w:nsid w:val="27CF6182"/>
     <w:multiLevelType w:val="multilevel"/>
     <w:tmpl w:val="E766C4E4"/>
@@ -1459,7 +1809,7 @@
       </w:rPr>
     </w:lvl>
   </w:abstractNum>
-  <w:abstractNum w:abstractNumId="2" w15:restartNumberingAfterBreak="0">
+  <w:abstractNum w:abstractNumId="3" w15:restartNumberingAfterBreak="0">
     <w:nsid w:val="5174145C"/>
     <w:multiLevelType w:val="multilevel"/>
     <w:tmpl w:val="784EB6AA"/>
@@ -1609,13 +1959,16 @@
     </w:lvl>
   </w:abstractNum>
   <w:num w:numId="1" w16cid:durableId="1884632481">
-    <w:abstractNumId w:val="0"/>
+    <w:abstractNumId w:val="1"/>
   </w:num>
   <w:num w:numId="2" w16cid:durableId="244536297">
+    <w:abstractNumId w:val="3"/>
+  </w:num>
+  <w:num w:numId="3" w16cid:durableId="2012217680">
     <w:abstractNumId w:val="2"/>
   </w:num>
-  <w:num w:numId="3" w16cid:durableId="2012217680">
-    <w:abstractNumId w:val="1"/>
+  <w:num w:numId="4" w16cid:durableId="1139105400">
+    <w:abstractNumId w:val="0"/>
   </w:num>
 </w:numbering>
 </file>

</xml_diff>

<commit_message>
Proje 5: Artımlı yükleme ve MERGE mimarisi sisteme entegre edildi
</commit_message>
<xml_diff>
--- a/BLM4522_Proje5/Proje5_Rapor.docx
+++ b/BLM4522_Proje5/Proje5_Rapor.docx
@@ -416,7 +416,7 @@
           <w:r>
             <w:fldChar w:fldCharType="separate"/>
           </w:r>
-          <w:hyperlink w:anchor="_Toc231396391" w:history="1">
+          <w:hyperlink w:anchor="_Toc231396572" w:history="1">
             <w:r>
               <w:rPr>
                 <w:rStyle w:val="Kpr"/>
@@ -443,7 +443,7 @@
                 <w:noProof/>
                 <w:webHidden/>
               </w:rPr>
-              <w:instrText xml:space="preserve"> PAGEREF _Toc231396391 \h </w:instrText>
+              <w:instrText xml:space="preserve"> PAGEREF _Toc231396572 \h </w:instrText>
             </w:r>
             <w:r>
               <w:rPr>
@@ -487,7 +487,7 @@
               <w14:ligatures w14:val="standardContextual"/>
             </w:rPr>
           </w:pPr>
-          <w:hyperlink w:anchor="_Toc231396392" w:history="1">
+          <w:hyperlink w:anchor="_Toc231396573" w:history="1">
             <w:r>
               <w:rPr>
                 <w:rStyle w:val="Kpr"/>
@@ -514,7 +514,7 @@
                 <w:noProof/>
                 <w:webHidden/>
               </w:rPr>
-              <w:instrText xml:space="preserve"> PAGEREF _Toc231396392 \h </w:instrText>
+              <w:instrText xml:space="preserve"> PAGEREF _Toc231396573 \h </w:instrText>
             </w:r>
             <w:r>
               <w:rPr>
@@ -558,7 +558,7 @@
               <w14:ligatures w14:val="standardContextual"/>
             </w:rPr>
           </w:pPr>
-          <w:hyperlink w:anchor="_Toc231396393" w:history="1">
+          <w:hyperlink w:anchor="_Toc231396574" w:history="1">
             <w:r>
               <w:rPr>
                 <w:rStyle w:val="Kpr"/>
@@ -585,7 +585,7 @@
                 <w:noProof/>
                 <w:webHidden/>
               </w:rPr>
-              <w:instrText xml:space="preserve"> PAGEREF _Toc231396393 \h </w:instrText>
+              <w:instrText xml:space="preserve"> PAGEREF _Toc231396574 \h </w:instrText>
             </w:r>
             <w:r>
               <w:rPr>
@@ -629,7 +629,7 @@
               <w14:ligatures w14:val="standardContextual"/>
             </w:rPr>
           </w:pPr>
-          <w:hyperlink w:anchor="_Toc231396394" w:history="1">
+          <w:hyperlink w:anchor="_Toc231396575" w:history="1">
             <w:r>
               <w:rPr>
                 <w:rStyle w:val="Kpr"/>
@@ -656,7 +656,7 @@
                 <w:noProof/>
                 <w:webHidden/>
               </w:rPr>
-              <w:instrText xml:space="preserve"> PAGEREF _Toc231396394 \h </w:instrText>
+              <w:instrText xml:space="preserve"> PAGEREF _Toc231396575 \h </w:instrText>
             </w:r>
             <w:r>
               <w:rPr>
@@ -700,7 +700,7 @@
               <w14:ligatures w14:val="standardContextual"/>
             </w:rPr>
           </w:pPr>
-          <w:hyperlink w:anchor="_Toc231396395" w:history="1">
+          <w:hyperlink w:anchor="_Toc231396576" w:history="1">
             <w:r>
               <w:rPr>
                 <w:rStyle w:val="Kpr"/>
@@ -727,7 +727,7 @@
                 <w:noProof/>
                 <w:webHidden/>
               </w:rPr>
-              <w:instrText xml:space="preserve"> PAGEREF _Toc231396395 \h </w:instrText>
+              <w:instrText xml:space="preserve"> PAGEREF _Toc231396576 \h </w:instrText>
             </w:r>
             <w:r>
               <w:rPr>
@@ -748,6 +748,77 @@
                 <w:webHidden/>
               </w:rPr>
               <w:t>6</w:t>
+            </w:r>
+            <w:r>
+              <w:rPr>
+                <w:noProof/>
+                <w:webHidden/>
+              </w:rPr>
+              <w:fldChar w:fldCharType="end"/>
+            </w:r>
+          </w:hyperlink>
+        </w:p>
+        <w:p>
+          <w:pPr>
+            <w:pStyle w:val="T2"/>
+            <w:rPr>
+              <w:rFonts w:asciiTheme="minorHAnsi" w:eastAsiaTheme="minorEastAsia" w:hAnsiTheme="minorHAnsi" w:cstheme="minorBidi"/>
+              <w:b w:val="0"/>
+              <w:noProof/>
+              <w:kern w:val="2"/>
+              <w:u w:val="none"/>
+              <w:lang w:eastAsia="tr-TR"/>
+              <w14:ligatures w14:val="standardContextual"/>
+            </w:rPr>
+          </w:pPr>
+          <w:hyperlink w:anchor="_Toc231396577" w:history="1">
+            <w:r>
+              <w:rPr>
+                <w:rStyle w:val="Kpr"/>
+                <w:noProof/>
+              </w:rPr>
+              <w:t>ADIM 5: Artımlı Yükleme (Incremental Load) ve MERGE Mimarisi</w:t>
+            </w:r>
+            <w:r>
+              <w:rPr>
+                <w:noProof/>
+                <w:webHidden/>
+              </w:rPr>
+              <w:tab/>
+            </w:r>
+            <w:r>
+              <w:rPr>
+                <w:noProof/>
+                <w:webHidden/>
+              </w:rPr>
+              <w:fldChar w:fldCharType="begin"/>
+            </w:r>
+            <w:r>
+              <w:rPr>
+                <w:noProof/>
+                <w:webHidden/>
+              </w:rPr>
+              <w:instrText xml:space="preserve"> PAGEREF _Toc231396577 \h </w:instrText>
+            </w:r>
+            <w:r>
+              <w:rPr>
+                <w:noProof/>
+                <w:webHidden/>
+              </w:rPr>
+            </w:r>
+            <w:r>
+              <w:rPr>
+                <w:noProof/>
+                <w:webHidden/>
+              </w:rPr>
+              <w:fldChar w:fldCharType="separate"/>
+            </w:r>
+            <w:r>
+              <w:rPr>
+                <w:noProof/>
+                <w:webHidden/>
+              </w:rPr>
+              <w:t>7</w:t>
             </w:r>
             <w:r>
               <w:rPr>
@@ -797,7 +868,7 @@
         <w:pStyle w:val="Balk1"/>
         <w:jc w:val="center"/>
       </w:pPr>
-      <w:bookmarkStart w:id="0" w:name="_Toc231396391"/>
+      <w:bookmarkStart w:id="0" w:name="_Toc231396572"/>
       <w:r>
         <w:t xml:space="preserve">Proje </w:t>
       </w:r>
@@ -826,7 +897,7 @@
       <w:pPr>
         <w:pStyle w:val="Balk2"/>
       </w:pPr>
-      <w:bookmarkStart w:id="1" w:name="_Toc231396392"/>
+      <w:bookmarkStart w:id="1" w:name="_Toc231396573"/>
       <w:r>
         <w:t xml:space="preserve">Adım 1: </w:t>
       </w:r>
@@ -959,9 +1030,6 @@
     <w:p/>
     <w:p/>
     <w:p/>
-    <w:p/>
-    <w:p/>
-    <w:p/>
     <w:p>
       <w:r>
         <w:t>03.06.2026</w:t>
@@ -971,7 +1039,7 @@
       <w:pPr>
         <w:pStyle w:val="Balk2"/>
       </w:pPr>
-      <w:bookmarkStart w:id="2" w:name="_Toc231396393"/>
+      <w:bookmarkStart w:id="2" w:name="_Toc231396574"/>
       <w:r>
         <w:t>Adım 2:</w:t>
       </w:r>
@@ -1101,6 +1169,7 @@
     <w:p/>
     <w:p/>
     <w:p/>
+    <w:p/>
     <w:p>
       <w:r>
         <w:t>03.06.2026</w:t>
@@ -1110,7 +1179,7 @@
       <w:pPr>
         <w:pStyle w:val="Balk2"/>
       </w:pPr>
-      <w:bookmarkStart w:id="3" w:name="_Toc231396394"/>
+      <w:bookmarkStart w:id="3" w:name="_Toc231396575"/>
       <w:r>
         <w:t>ADIM 3: Veri Kalitesi Raporlarının Oluşturulması ve Süreç Metrikleri</w:t>
       </w:r>
@@ -1242,7 +1311,7 @@
       <w:pPr>
         <w:pStyle w:val="Balk2"/>
       </w:pPr>
-      <w:bookmarkStart w:id="4" w:name="_Toc231396395"/>
+      <w:bookmarkStart w:id="4" w:name="_Toc231396576"/>
       <w:r>
         <w:t>ADIM 4: Aykırı Veri Yönetimi ve Hata Günlüğü</w:t>
       </w:r>
@@ -1312,6 +1381,9 @@
     </w:p>
     <w:p>
       <w:r>
+        <w:rPr>
+          <w:noProof/>
+        </w:rPr>
         <w:drawing>
           <wp:inline distT="0" distB="0" distL="0" distR="0" wp14:anchorId="35FA03F0" wp14:editId="1BAFA7BA">
             <wp:extent cx="5600700" cy="1082880"/>
@@ -1350,6 +1422,188 @@
       </w:r>
     </w:p>
     <w:p/>
+    <w:p/>
+    <w:p/>
+    <w:p/>
+    <w:p/>
+    <w:p/>
+    <w:p/>
+    <w:p/>
+    <w:p/>
+    <w:p/>
+    <w:p/>
+    <w:p/>
+    <w:p/>
+    <w:p>
+      <w:r>
+        <w:t>03.06.2026</w:t>
+      </w:r>
+    </w:p>
+    <w:p>
+      <w:pPr>
+        <w:pStyle w:val="Balk2"/>
+      </w:pPr>
+      <w:bookmarkStart w:id="5" w:name="_Toc231396577"/>
+      <w:r>
+        <w:t>ADIM 5: Artımlı Yükleme (</w:t>
+      </w:r>
+      <w:proofErr w:type="spellStart"/>
+      <w:r>
+        <w:t>Incremental</w:t>
+      </w:r>
+      <w:proofErr w:type="spellEnd"/>
+      <w:r>
+        <w:t xml:space="preserve"> </w:t>
+      </w:r>
+      <w:proofErr w:type="spellStart"/>
+      <w:r>
+        <w:t>Load</w:t>
+      </w:r>
+      <w:proofErr w:type="spellEnd"/>
+      <w:r>
+        <w:t>) ve MERGE Mimarisi</w:t>
+      </w:r>
+      <w:bookmarkEnd w:id="5"/>
+    </w:p>
+    <w:p>
+      <w:r>
+        <w:t xml:space="preserve">Kurumsal veri ambarı sistemlerinde performans kayıplarını engellemek amacıyla, her ETL çalışmasında hedef tabloyu sıfırlamak yerine sadece değişen veya yeni eklenen verilerin işlendiği </w:t>
+      </w:r>
+      <w:r>
+        <w:rPr>
+          <w:i/>
+          <w:iCs/>
+        </w:rPr>
+        <w:t>Artımlı Yükleme (</w:t>
+      </w:r>
+      <w:proofErr w:type="spellStart"/>
+      <w:r>
+        <w:rPr>
+          <w:i/>
+          <w:iCs/>
+        </w:rPr>
+        <w:t>Incremental</w:t>
+      </w:r>
+      <w:proofErr w:type="spellEnd"/>
+      <w:r>
+        <w:rPr>
+          <w:i/>
+          <w:iCs/>
+        </w:rPr>
+        <w:t xml:space="preserve"> </w:t>
+      </w:r>
+      <w:proofErr w:type="spellStart"/>
+      <w:r>
+        <w:rPr>
+          <w:i/>
+          <w:iCs/>
+        </w:rPr>
+        <w:t>Load</w:t>
+      </w:r>
+      <w:proofErr w:type="spellEnd"/>
+      <w:r>
+        <w:rPr>
+          <w:i/>
+          <w:iCs/>
+        </w:rPr>
+        <w:t>)</w:t>
+      </w:r>
+      <w:r>
+        <w:t xml:space="preserve"> stratejisi uygulanmıştır. Bu süreç T-SQL mimarisindeki MERGE yapısı ile optimize edilmiştir.</w:t>
+      </w:r>
+    </w:p>
+    <w:p>
+      <w:pPr>
+        <w:numPr>
+          <w:ilvl w:val="0"/>
+          <w:numId w:val="5"/>
+        </w:numPr>
+      </w:pPr>
+      <w:r>
+        <w:t xml:space="preserve">Geliştirilen MERGE algoritması sayesinde, kaynak sistemdeki kayıtlar ile hedef ambardaki kayıtlar </w:t>
+      </w:r>
+      <w:proofErr w:type="spellStart"/>
+      <w:r>
+        <w:t>BusinessEntityID</w:t>
+      </w:r>
+      <w:proofErr w:type="spellEnd"/>
+      <w:r>
+        <w:t xml:space="preserve"> anahtarı üzerinden anlık olarak karşılaştırılmaktadır.</w:t>
+      </w:r>
+    </w:p>
+    <w:p>
+      <w:pPr>
+        <w:numPr>
+          <w:ilvl w:val="0"/>
+          <w:numId w:val="5"/>
+        </w:numPr>
+      </w:pPr>
+      <w:r>
+        <w:t>Sistemde daha önce var olan fakat bilgileri güncellenen kayıtlar için otomatik olarak UPDATE mekanizması, sisteme yeni dahil olan kayıtlar için ise INSERT mekanizması tetiklenmektedir.</w:t>
+      </w:r>
+    </w:p>
+    <w:p>
+      <w:pPr>
+        <w:numPr>
+          <w:ilvl w:val="0"/>
+          <w:numId w:val="5"/>
+        </w:numPr>
+      </w:pPr>
+      <w:r>
+        <w:t xml:space="preserve">Yapılan bu yapılandırma ile gereksiz disk ve işlemci (CPU) kullanımı minimize edilmekte, kurumsal düzeyde yüksek performanslı ve sürdürülebilir bir ETL veri hattı (Data </w:t>
+      </w:r>
+      <w:proofErr w:type="spellStart"/>
+      <w:r>
+        <w:t>Pipeline</w:t>
+      </w:r>
+      <w:proofErr w:type="spellEnd"/>
+      <w:r>
+        <w:t>) elde edilmektedir.</w:t>
+      </w:r>
+    </w:p>
+    <w:p>
+      <w:pPr>
+        <w:ind w:left="720"/>
+      </w:pPr>
+      <w:r>
+        <w:drawing>
+          <wp:inline distT="0" distB="0" distL="0" distR="0" wp14:anchorId="72588EF5" wp14:editId="63933F7F">
+            <wp:extent cx="4861560" cy="1319217"/>
+            <wp:effectExtent l="0" t="0" r="0" b="0"/>
+            <wp:docPr id="720718098" name="Resim 1" descr="metin, ekran görüntüsü, yazı tipi, çizgi içeren bir resim&#10;&#10;Yapay zeka tarafından oluşturulmuş içerik yanlış olabilir."/>
+            <wp:cNvGraphicFramePr>
+              <a:graphicFrameLocks xmlns:a="http://schemas.openxmlformats.org/drawingml/2006/main" noChangeAspect="1"/>
+            </wp:cNvGraphicFramePr>
+            <a:graphic xmlns:a="http://schemas.openxmlformats.org/drawingml/2006/main">
+              <a:graphicData uri="http://schemas.openxmlformats.org/drawingml/2006/picture">
+                <pic:pic xmlns:pic="http://schemas.openxmlformats.org/drawingml/2006/picture">
+                  <pic:nvPicPr>
+                    <pic:cNvPr id="720718098" name="Resim 1" descr="metin, ekran görüntüsü, yazı tipi, çizgi içeren bir resim&#10;&#10;Yapay zeka tarafından oluşturulmuş içerik yanlış olabilir."/>
+                    <pic:cNvPicPr/>
+                  </pic:nvPicPr>
+                  <pic:blipFill>
+                    <a:blip r:embed="rId10"/>
+                    <a:stretch>
+                      <a:fillRect/>
+                    </a:stretch>
+                  </pic:blipFill>
+                  <pic:spPr>
+                    <a:xfrm>
+                      <a:off x="0" y="0"/>
+                      <a:ext cx="4882722" cy="1324959"/>
+                    </a:xfrm>
+                    <a:prstGeom prst="rect">
+                      <a:avLst/>
+                    </a:prstGeom>
+                  </pic:spPr>
+                </pic:pic>
+              </a:graphicData>
+            </a:graphic>
+          </wp:inline>
+        </w:drawing>
+      </w:r>
+    </w:p>
+    <w:p/>
     <w:sectPr>
       <w:pgSz w:w="11906" w:h="16838"/>
       <w:pgMar w:top="1417" w:right="1417" w:bottom="1417" w:left="1417" w:header="708" w:footer="708" w:gutter="0"/>
@@ -1363,6 +1617,155 @@
 <file path=word/numbering.xml><?xml version="1.0" encoding="utf-8"?>
 <w:numbering xmlns:wpc="http://schemas.microsoft.com/office/word/2010/wordprocessingCanvas" xmlns:cx="http://schemas.microsoft.com/office/drawing/2014/chartex" xmlns:cx1="http://schemas.microsoft.com/office/drawing/2015/9/8/chartex" xmlns:cx2="http://schemas.microsoft.com/office/drawing/2015/10/21/chartex" xmlns:cx3="http://schemas.microsoft.com/office/drawing/2016/5/9/chartex" xmlns:cx4="http://schemas.microsoft.com/office/drawing/2016/5/10/chartex" xmlns:cx5="http://schemas.microsoft.com/office/drawing/2016/5/11/chartex" xmlns:cx6="http://schemas.microsoft.com/office/drawing/2016/5/12/chartex" xmlns:cx7="http://schemas.microsoft.com/office/drawing/2016/5/13/chartex" xmlns:cx8="http://schemas.microsoft.com/office/drawing/2016/5/14/chartex" xmlns:mc="http://schemas.openxmlformats.org/markup-compatibility/2006" xmlns:aink="http://schemas.microsoft.com/office/drawing/2016/ink" xmlns:am3d="http://schemas.microsoft.com/office/drawing/2017/model3d" xmlns:o="urn:schemas-microsoft-com:office:office" xmlns:oel="http://schemas.microsoft.com/office/2019/extlst" xmlns:r="http://schemas.openxmlformats.org/officeDocument/2006/relationships" xmlns:m="http://schemas.openxmlformats.org/officeDocument/2006/math" xmlns:v="urn:schemas-microsoft-com:vml" xmlns:wp14="http://schemas.microsoft.com/office/word/2010/wordprocessingDrawing" xmlns:wp="http://schemas.openxmlformats.org/drawingml/2006/wordprocessingDrawing" xmlns:w10="urn:schemas-microsoft-com:office:word" xmlns:w="http://schemas.openxmlformats.org/wordprocessingml/2006/main" xmlns:w14="http://schemas.microsoft.com/office/word/2010/wordml" xmlns:w15="http://schemas.microsoft.com/office/word/2012/wordml" xmlns:w16cex="http://schemas.microsoft.com/office/word/2018/wordml/cex" xmlns:w16cid="http://schemas.microsoft.com/office/word/2016/wordml/cid" xmlns:w16="http://schemas.microsoft.com/office/word/2018/wordml" xmlns:w16du="http://schemas.microsoft.com/office/word/2023/wordml/word16du" xmlns:w16sdtdh="http://schemas.microsoft.com/office/word/2020/wordml/sdtdatahash" xmlns:w16sdtfl="http://schemas.microsoft.com/office/word/2024/wordml/sdtformatlock" xmlns:w16se="http://schemas.microsoft.com/office/word/2015/wordml/symex" xmlns:wpg="http://schemas.microsoft.com/office/word/2010/wordprocessingGroup" xmlns:wpi="http://schemas.microsoft.com/office/word/2010/wordprocessingInk" xmlns:wne="http://schemas.microsoft.com/office/word/2006/wordml" xmlns:wps="http://schemas.microsoft.com/office/word/2010/wordprocessingShape" mc:Ignorable="w14 w15 w16se w16cid w16 w16cex w16sdtdh w16sdtfl w16du wp14">
   <w:abstractNum w:abstractNumId="0" w15:restartNumberingAfterBreak="0">
+    <w:nsid w:val="04270E07"/>
+    <w:multiLevelType w:val="multilevel"/>
+    <w:tmpl w:val="9E6CFFA0"/>
+    <w:lvl w:ilvl="0">
+      <w:start w:val="1"/>
+      <w:numFmt w:val="bullet"/>
+      <w:lvlText w:val=""/>
+      <w:lvlJc w:val="left"/>
+      <w:pPr>
+        <w:tabs>
+          <w:tab w:val="num" w:pos="720"/>
+        </w:tabs>
+        <w:ind w:left="720" w:hanging="360"/>
+      </w:pPr>
+      <w:rPr>
+        <w:rFonts w:ascii="Symbol" w:hAnsi="Symbol" w:hint="default"/>
+        <w:sz w:val="20"/>
+      </w:rPr>
+    </w:lvl>
+    <w:lvl w:ilvl="1" w:tentative="1">
+      <w:start w:val="1"/>
+      <w:numFmt w:val="bullet"/>
+      <w:lvlText w:val="o"/>
+      <w:lvlJc w:val="left"/>
+      <w:pPr>
+        <w:tabs>
+          <w:tab w:val="num" w:pos="1440"/>
+        </w:tabs>
+        <w:ind w:left="1440" w:hanging="360"/>
+      </w:pPr>
+      <w:rPr>
+        <w:rFonts w:ascii="Courier New" w:hAnsi="Courier New" w:hint="default"/>
+        <w:sz w:val="20"/>
+      </w:rPr>
+    </w:lvl>
+    <w:lvl w:ilvl="2" w:tentative="1">
+      <w:start w:val="1"/>
+      <w:numFmt w:val="bullet"/>
+      <w:lvlText w:val=""/>
+      <w:lvlJc w:val="left"/>
+      <w:pPr>
+        <w:tabs>
+          <w:tab w:val="num" w:pos="2160"/>
+        </w:tabs>
+        <w:ind w:left="2160" w:hanging="360"/>
+      </w:pPr>
+      <w:rPr>
+        <w:rFonts w:ascii="Wingdings" w:hAnsi="Wingdings" w:hint="default"/>
+        <w:sz w:val="20"/>
+      </w:rPr>
+    </w:lvl>
+    <w:lvl w:ilvl="3" w:tentative="1">
+      <w:start w:val="1"/>
+      <w:numFmt w:val="bullet"/>
+      <w:lvlText w:val=""/>
+      <w:lvlJc w:val="left"/>
+      <w:pPr>
+        <w:tabs>
+          <w:tab w:val="num" w:pos="2880"/>
+        </w:tabs>
+        <w:ind w:left="2880" w:hanging="360"/>
+      </w:pPr>
+      <w:rPr>
+        <w:rFonts w:ascii="Wingdings" w:hAnsi="Wingdings" w:hint="default"/>
+        <w:sz w:val="20"/>
+      </w:rPr>
+    </w:lvl>
+    <w:lvl w:ilvl="4" w:tentative="1">
+      <w:start w:val="1"/>
+      <w:numFmt w:val="bullet"/>
+      <w:lvlText w:val=""/>
+      <w:lvlJc w:val="left"/>
+      <w:pPr>
+        <w:tabs>
+          <w:tab w:val="num" w:pos="3600"/>
+        </w:tabs>
+        <w:ind w:left="3600" w:hanging="360"/>
+      </w:pPr>
+      <w:rPr>
+        <w:rFonts w:ascii="Wingdings" w:hAnsi="Wingdings" w:hint="default"/>
+        <w:sz w:val="20"/>
+      </w:rPr>
+    </w:lvl>
+    <w:lvl w:ilvl="5" w:tentative="1">
+      <w:start w:val="1"/>
+      <w:numFmt w:val="bullet"/>
+      <w:lvlText w:val=""/>
+      <w:lvlJc w:val="left"/>
+      <w:pPr>
+        <w:tabs>
+          <w:tab w:val="num" w:pos="4320"/>
+        </w:tabs>
+        <w:ind w:left="4320" w:hanging="360"/>
+      </w:pPr>
+      <w:rPr>
+        <w:rFonts w:ascii="Wingdings" w:hAnsi="Wingdings" w:hint="default"/>
+        <w:sz w:val="20"/>
+      </w:rPr>
+    </w:lvl>
+    <w:lvl w:ilvl="6" w:tentative="1">
+      <w:start w:val="1"/>
+      <w:numFmt w:val="bullet"/>
+      <w:lvlText w:val=""/>
+      <w:lvlJc w:val="left"/>
+      <w:pPr>
+        <w:tabs>
+          <w:tab w:val="num" w:pos="5040"/>
+        </w:tabs>
+        <w:ind w:left="5040" w:hanging="360"/>
+      </w:pPr>
+      <w:rPr>
+        <w:rFonts w:ascii="Wingdings" w:hAnsi="Wingdings" w:hint="default"/>
+        <w:sz w:val="20"/>
+      </w:rPr>
+    </w:lvl>
+    <w:lvl w:ilvl="7" w:tentative="1">
+      <w:start w:val="1"/>
+      <w:numFmt w:val="bullet"/>
+      <w:lvlText w:val=""/>
+      <w:lvlJc w:val="left"/>
+      <w:pPr>
+        <w:tabs>
+          <w:tab w:val="num" w:pos="5760"/>
+        </w:tabs>
+        <w:ind w:left="5760" w:hanging="360"/>
+      </w:pPr>
+      <w:rPr>
+        <w:rFonts w:ascii="Wingdings" w:hAnsi="Wingdings" w:hint="default"/>
+        <w:sz w:val="20"/>
+      </w:rPr>
+    </w:lvl>
+    <w:lvl w:ilvl="8" w:tentative="1">
+      <w:start w:val="1"/>
+      <w:numFmt w:val="bullet"/>
+      <w:lvlText w:val=""/>
+      <w:lvlJc w:val="left"/>
+      <w:pPr>
+        <w:tabs>
+          <w:tab w:val="num" w:pos="6480"/>
+        </w:tabs>
+        <w:ind w:left="6480" w:hanging="360"/>
+      </w:pPr>
+      <w:rPr>
+        <w:rFonts w:ascii="Wingdings" w:hAnsi="Wingdings" w:hint="default"/>
+        <w:sz w:val="20"/>
+      </w:rPr>
+    </w:lvl>
+  </w:abstractNum>
+  <w:abstractNum w:abstractNumId="1" w15:restartNumberingAfterBreak="0">
     <w:nsid w:val="0FBE21E7"/>
     <w:multiLevelType w:val="multilevel"/>
     <w:tmpl w:val="AC42DB82"/>
@@ -1511,7 +1914,7 @@
       </w:rPr>
     </w:lvl>
   </w:abstractNum>
-  <w:abstractNum w:abstractNumId="1" w15:restartNumberingAfterBreak="0">
+  <w:abstractNum w:abstractNumId="2" w15:restartNumberingAfterBreak="0">
     <w:nsid w:val="1608722E"/>
     <w:multiLevelType w:val="multilevel"/>
     <w:tmpl w:val="5DD06EC4"/>
@@ -1660,7 +2063,7 @@
       </w:rPr>
     </w:lvl>
   </w:abstractNum>
-  <w:abstractNum w:abstractNumId="2" w15:restartNumberingAfterBreak="0">
+  <w:abstractNum w:abstractNumId="3" w15:restartNumberingAfterBreak="0">
     <w:nsid w:val="27CF6182"/>
     <w:multiLevelType w:val="multilevel"/>
     <w:tmpl w:val="E766C4E4"/>
@@ -1809,7 +2212,7 @@
       </w:rPr>
     </w:lvl>
   </w:abstractNum>
-  <w:abstractNum w:abstractNumId="3" w15:restartNumberingAfterBreak="0">
+  <w:abstractNum w:abstractNumId="4" w15:restartNumberingAfterBreak="0">
     <w:nsid w:val="5174145C"/>
     <w:multiLevelType w:val="multilevel"/>
     <w:tmpl w:val="784EB6AA"/>
@@ -1959,15 +2362,18 @@
     </w:lvl>
   </w:abstractNum>
   <w:num w:numId="1" w16cid:durableId="1884632481">
+    <w:abstractNumId w:val="2"/>
+  </w:num>
+  <w:num w:numId="2" w16cid:durableId="244536297">
+    <w:abstractNumId w:val="4"/>
+  </w:num>
+  <w:num w:numId="3" w16cid:durableId="2012217680">
+    <w:abstractNumId w:val="3"/>
+  </w:num>
+  <w:num w:numId="4" w16cid:durableId="1139105400">
     <w:abstractNumId w:val="1"/>
   </w:num>
-  <w:num w:numId="2" w16cid:durableId="244536297">
-    <w:abstractNumId w:val="3"/>
-  </w:num>
-  <w:num w:numId="3" w16cid:durableId="2012217680">
-    <w:abstractNumId w:val="2"/>
-  </w:num>
-  <w:num w:numId="4" w16cid:durableId="1139105400">
+  <w:num w:numId="5" w16cid:durableId="877813133">
     <w:abstractNumId w:val="0"/>
   </w:num>
 </w:numbering>

</xml_diff>

<commit_message>
Proje 5: Sonuç kısmı eklendi.
</commit_message>
<xml_diff>
--- a/BLM4522_Proje5/Proje5_Rapor.docx
+++ b/BLM4522_Proje5/Proje5_Rapor.docx
@@ -1566,6 +1566,9 @@
         <w:ind w:left="720"/>
       </w:pPr>
       <w:r>
+        <w:rPr>
+          <w:noProof/>
+        </w:rPr>
         <w:drawing>
           <wp:inline distT="0" distB="0" distL="0" distR="0" wp14:anchorId="72588EF5" wp14:editId="63933F7F">
             <wp:extent cx="4861560" cy="1319217"/>
@@ -1604,6 +1607,151 @@
       </w:r>
     </w:p>
     <w:p/>
+    <w:p/>
+    <w:p/>
+    <w:p/>
+    <w:p/>
+    <w:p/>
+    <w:p/>
+    <w:p/>
+    <w:p/>
+    <w:p/>
+    <w:p>
+      <w:r>
+        <w:lastRenderedPageBreak/>
+        <w:t>03.06.2026</w:t>
+      </w:r>
+    </w:p>
+    <w:p>
+      <w:pPr>
+        <w:pStyle w:val="Balk2"/>
+      </w:pPr>
+      <w:r>
+        <w:t>Adım 6: Sonuç</w:t>
+      </w:r>
+    </w:p>
+    <w:p>
+      <w:r>
+        <w:t>Bu proje kapsamında, veri temizleme ve ETL (</w:t>
+      </w:r>
+      <w:proofErr w:type="spellStart"/>
+      <w:r>
+        <w:t>Extract</w:t>
+      </w:r>
+      <w:proofErr w:type="spellEnd"/>
+      <w:r>
+        <w:t xml:space="preserve">, </w:t>
+      </w:r>
+      <w:proofErr w:type="spellStart"/>
+      <w:r>
+        <w:t>Transform</w:t>
+      </w:r>
+      <w:proofErr w:type="spellEnd"/>
+      <w:r>
+        <w:t xml:space="preserve">, </w:t>
+      </w:r>
+      <w:proofErr w:type="spellStart"/>
+      <w:r>
+        <w:t>Load</w:t>
+      </w:r>
+      <w:proofErr w:type="spellEnd"/>
+      <w:r>
+        <w:t xml:space="preserve">) süreçleri AdventureWorks2019 </w:t>
+      </w:r>
+      <w:proofErr w:type="spellStart"/>
+      <w:r>
+        <w:t>veritabanı</w:t>
+      </w:r>
+      <w:proofErr w:type="spellEnd"/>
+      <w:r>
+        <w:t xml:space="preserve"> kullanılarak adım adım modellenmiştir. Yapılan işlemler ve elde edilen sonuçlar şu şekilde özetlenmektedir:</w:t>
+      </w:r>
+    </w:p>
+    <w:p>
+      <w:pPr>
+        <w:numPr>
+          <w:ilvl w:val="0"/>
+          <w:numId w:val="6"/>
+        </w:numPr>
+      </w:pPr>
+      <w:r>
+        <w:t xml:space="preserve">Veri Temizleme ve Standartlaştırma: </w:t>
+      </w:r>
+      <w:proofErr w:type="spellStart"/>
+      <w:r>
+        <w:t>Person.PersonPhone</w:t>
+      </w:r>
+      <w:proofErr w:type="spellEnd"/>
+      <w:r>
+        <w:t xml:space="preserve"> tablosunda bulunan parantezli, </w:t>
+      </w:r>
+      <w:proofErr w:type="spellStart"/>
+      <w:r>
+        <w:t>tireli</w:t>
+      </w:r>
+      <w:proofErr w:type="spellEnd"/>
+      <w:r>
+        <w:t xml:space="preserve"> ve boşluklu telefon numaraları SQL fonksiyonları yardımıyla temizlenmiştir. Ayrıca ayrı duran ad ve </w:t>
+      </w:r>
+      <w:proofErr w:type="spellStart"/>
+      <w:r>
+        <w:t>soyad</w:t>
+      </w:r>
+      <w:proofErr w:type="spellEnd"/>
+      <w:r>
+        <w:t xml:space="preserve"> bilgileri birleştirilerek verilerin tek bir formatta saklanması sağlanmaktadır.</w:t>
+      </w:r>
+    </w:p>
+    <w:p>
+      <w:pPr>
+        <w:numPr>
+          <w:ilvl w:val="0"/>
+          <w:numId w:val="6"/>
+        </w:numPr>
+      </w:pPr>
+      <w:r>
+        <w:t xml:space="preserve">Hatalı Verilerin Yönetimi: Temizlik aşamasından sonra bile kurumsal kurallara uymayan (örneğin çok kısa kalan) kusurlu numaraların tespiti için </w:t>
+      </w:r>
+      <w:proofErr w:type="spellStart"/>
+      <w:r>
+        <w:t>ETL_Error_Log</w:t>
+      </w:r>
+      <w:proofErr w:type="spellEnd"/>
+      <w:r>
+        <w:t xml:space="preserve"> adında bir hata tablosu oluşturulmuştur. Bu sayede hatalı kayıtların ana tabloyu kirletmesi otomatik olarak engellenmektedir.</w:t>
+      </w:r>
+    </w:p>
+    <w:p>
+      <w:pPr>
+        <w:numPr>
+          <w:ilvl w:val="0"/>
+          <w:numId w:val="6"/>
+        </w:numPr>
+      </w:pPr>
+      <w:r>
+        <w:t>Performans ve Artımlı Yükleme: Sistemi yormamak adına her ETL çalışmasında tüm tabloyu silip baştan yüklemek yerine, sadece yeni gelen veya güncellenen verileri sisteme işleyen MERGE yapısı kullanılmıştır. Bu sayede sistemin daha verimli çalışması hedeflenmektedir.</w:t>
+      </w:r>
+    </w:p>
+    <w:p>
+      <w:pPr>
+        <w:rPr>
+          <w:b/>
+          <w:bCs/>
+        </w:rPr>
+      </w:pPr>
+      <w:r>
+        <w:t xml:space="preserve">Sonuç olarak, </w:t>
+      </w:r>
+      <w:proofErr w:type="spellStart"/>
+      <w:r>
+        <w:t>veritabanındaki</w:t>
+      </w:r>
+      <w:proofErr w:type="spellEnd"/>
+      <w:r>
+        <w:t xml:space="preserve"> ham ve düzensiz verilerin SQL komutları kullanılarak nasıl analiz edileceği, temizleneceği ve düzenli bir hedef tabloya aktarılacağı uygulamalı olarak ortaya konulmuştur.</w:t>
+      </w:r>
+    </w:p>
+    <w:p/>
     <w:sectPr>
       <w:pgSz w:w="11906" w:h="16838"/>
       <w:pgMar w:top="1417" w:right="1417" w:bottom="1417" w:left="1417" w:header="708" w:footer="708" w:gutter="0"/>
@@ -2213,6 +2361,155 @@
     </w:lvl>
   </w:abstractNum>
   <w:abstractNum w:abstractNumId="4" w15:restartNumberingAfterBreak="0">
+    <w:nsid w:val="35163891"/>
+    <w:multiLevelType w:val="multilevel"/>
+    <w:tmpl w:val="80AA5B3E"/>
+    <w:lvl w:ilvl="0">
+      <w:start w:val="1"/>
+      <w:numFmt w:val="bullet"/>
+      <w:lvlText w:val=""/>
+      <w:lvlJc w:val="left"/>
+      <w:pPr>
+        <w:tabs>
+          <w:tab w:val="num" w:pos="720"/>
+        </w:tabs>
+        <w:ind w:left="720" w:hanging="360"/>
+      </w:pPr>
+      <w:rPr>
+        <w:rFonts w:ascii="Symbol" w:hAnsi="Symbol" w:hint="default"/>
+        <w:sz w:val="20"/>
+      </w:rPr>
+    </w:lvl>
+    <w:lvl w:ilvl="1" w:tentative="1">
+      <w:start w:val="1"/>
+      <w:numFmt w:val="bullet"/>
+      <w:lvlText w:val="o"/>
+      <w:lvlJc w:val="left"/>
+      <w:pPr>
+        <w:tabs>
+          <w:tab w:val="num" w:pos="1440"/>
+        </w:tabs>
+        <w:ind w:left="1440" w:hanging="360"/>
+      </w:pPr>
+      <w:rPr>
+        <w:rFonts w:ascii="Courier New" w:hAnsi="Courier New" w:hint="default"/>
+        <w:sz w:val="20"/>
+      </w:rPr>
+    </w:lvl>
+    <w:lvl w:ilvl="2" w:tentative="1">
+      <w:start w:val="1"/>
+      <w:numFmt w:val="bullet"/>
+      <w:lvlText w:val=""/>
+      <w:lvlJc w:val="left"/>
+      <w:pPr>
+        <w:tabs>
+          <w:tab w:val="num" w:pos="2160"/>
+        </w:tabs>
+        <w:ind w:left="2160" w:hanging="360"/>
+      </w:pPr>
+      <w:rPr>
+        <w:rFonts w:ascii="Wingdings" w:hAnsi="Wingdings" w:hint="default"/>
+        <w:sz w:val="20"/>
+      </w:rPr>
+    </w:lvl>
+    <w:lvl w:ilvl="3" w:tentative="1">
+      <w:start w:val="1"/>
+      <w:numFmt w:val="bullet"/>
+      <w:lvlText w:val=""/>
+      <w:lvlJc w:val="left"/>
+      <w:pPr>
+        <w:tabs>
+          <w:tab w:val="num" w:pos="2880"/>
+        </w:tabs>
+        <w:ind w:left="2880" w:hanging="360"/>
+      </w:pPr>
+      <w:rPr>
+        <w:rFonts w:ascii="Wingdings" w:hAnsi="Wingdings" w:hint="default"/>
+        <w:sz w:val="20"/>
+      </w:rPr>
+    </w:lvl>
+    <w:lvl w:ilvl="4" w:tentative="1">
+      <w:start w:val="1"/>
+      <w:numFmt w:val="bullet"/>
+      <w:lvlText w:val=""/>
+      <w:lvlJc w:val="left"/>
+      <w:pPr>
+        <w:tabs>
+          <w:tab w:val="num" w:pos="3600"/>
+        </w:tabs>
+        <w:ind w:left="3600" w:hanging="360"/>
+      </w:pPr>
+      <w:rPr>
+        <w:rFonts w:ascii="Wingdings" w:hAnsi="Wingdings" w:hint="default"/>
+        <w:sz w:val="20"/>
+      </w:rPr>
+    </w:lvl>
+    <w:lvl w:ilvl="5" w:tentative="1">
+      <w:start w:val="1"/>
+      <w:numFmt w:val="bullet"/>
+      <w:lvlText w:val=""/>
+      <w:lvlJc w:val="left"/>
+      <w:pPr>
+        <w:tabs>
+          <w:tab w:val="num" w:pos="4320"/>
+        </w:tabs>
+        <w:ind w:left="4320" w:hanging="360"/>
+      </w:pPr>
+      <w:rPr>
+        <w:rFonts w:ascii="Wingdings" w:hAnsi="Wingdings" w:hint="default"/>
+        <w:sz w:val="20"/>
+      </w:rPr>
+    </w:lvl>
+    <w:lvl w:ilvl="6" w:tentative="1">
+      <w:start w:val="1"/>
+      <w:numFmt w:val="bullet"/>
+      <w:lvlText w:val=""/>
+      <w:lvlJc w:val="left"/>
+      <w:pPr>
+        <w:tabs>
+          <w:tab w:val="num" w:pos="5040"/>
+        </w:tabs>
+        <w:ind w:left="5040" w:hanging="360"/>
+      </w:pPr>
+      <w:rPr>
+        <w:rFonts w:ascii="Wingdings" w:hAnsi="Wingdings" w:hint="default"/>
+        <w:sz w:val="20"/>
+      </w:rPr>
+    </w:lvl>
+    <w:lvl w:ilvl="7" w:tentative="1">
+      <w:start w:val="1"/>
+      <w:numFmt w:val="bullet"/>
+      <w:lvlText w:val=""/>
+      <w:lvlJc w:val="left"/>
+      <w:pPr>
+        <w:tabs>
+          <w:tab w:val="num" w:pos="5760"/>
+        </w:tabs>
+        <w:ind w:left="5760" w:hanging="360"/>
+      </w:pPr>
+      <w:rPr>
+        <w:rFonts w:ascii="Wingdings" w:hAnsi="Wingdings" w:hint="default"/>
+        <w:sz w:val="20"/>
+      </w:rPr>
+    </w:lvl>
+    <w:lvl w:ilvl="8" w:tentative="1">
+      <w:start w:val="1"/>
+      <w:numFmt w:val="bullet"/>
+      <w:lvlText w:val=""/>
+      <w:lvlJc w:val="left"/>
+      <w:pPr>
+        <w:tabs>
+          <w:tab w:val="num" w:pos="6480"/>
+        </w:tabs>
+        <w:ind w:left="6480" w:hanging="360"/>
+      </w:pPr>
+      <w:rPr>
+        <w:rFonts w:ascii="Wingdings" w:hAnsi="Wingdings" w:hint="default"/>
+        <w:sz w:val="20"/>
+      </w:rPr>
+    </w:lvl>
+  </w:abstractNum>
+  <w:abstractNum w:abstractNumId="5" w15:restartNumberingAfterBreak="0">
     <w:nsid w:val="5174145C"/>
     <w:multiLevelType w:val="multilevel"/>
     <w:tmpl w:val="784EB6AA"/>
@@ -2365,7 +2662,7 @@
     <w:abstractNumId w:val="2"/>
   </w:num>
   <w:num w:numId="2" w16cid:durableId="244536297">
-    <w:abstractNumId w:val="4"/>
+    <w:abstractNumId w:val="5"/>
   </w:num>
   <w:num w:numId="3" w16cid:durableId="2012217680">
     <w:abstractNumId w:val="3"/>
@@ -2375,6 +2672,9 @@
   </w:num>
   <w:num w:numId="5" w16cid:durableId="877813133">
     <w:abstractNumId w:val="0"/>
+  </w:num>
+  <w:num w:numId="6" w16cid:durableId="1910193529">
+    <w:abstractNumId w:val="4"/>
   </w:num>
 </w:numbering>
 </file>

</xml_diff>